<commit_message>
abstract and something also
</commit_message>
<xml_diff>
--- a/defense/docs/abstracts/abstract_en.docx
+++ b/defense/docs/abstracts/abstract_en.docx
@@ -245,7 +245,7 @@
         </w:rPr>
         <w:t>1.</w:t>
         <w:tab/>
-        <w:t>To analyse the medical, epidemiological, and technical context of automated DR diagnosis, the sources of fundus image quality variability, and the current state of CNN-based screening systems, and to formulate the research problem (Chapter 1).</w:t>
+        <w:t>To analyse the problem domain and formulate the research problem: the clinical grading of the disease, the screening requirements of resource-limited settings, the sources and measured impact of fundus image quality loss and its device-specific component, and the methodological practice of existing automated screening systems (Chapter 1).</w:t>
       </w:r>
     </w:p>
     <w:p>
@@ -263,7 +263,7 @@
         </w:rPr>
         <w:t>2.</w:t>
         <w:tab/>
-        <w:t>To establish the theoretical foundations of image enhancement (histogram equalisation, dual-constraint CLAHE, spatial filtering), of convolutional neural networks (convolution, pooling, loss functions for imbalanced data, regularisation), of transfer and self-supervised representation learning, and of explainability methods (Grad-CAM, ALO, IoU) (Chapter 2).</w:t>
+        <w:t>To specify the integrated preprocessing-CNN methodology: the 8-stage pipeline stage by stage with the theoretical foundations of each (histogram equalisation and the dual-constraint CLAHE clip limit, spatial filtering, illumination correction), the classification architectures (ResNet-50, EfficientNet-B3) and their adaptation to five-class grading, the pretraining and fine-tuning strategy, the explainability formalism (Grad-CAM, ALO, IoU), and the evaluation and statistical protocol (Chapter 2).</w:t>
       </w:r>
     </w:p>
     <w:p>
@@ -281,7 +281,7 @@
         </w:rPr>
         <w:t>3.</w:t>
         <w:tab/>
-        <w:t>To design and formalise the integrated preprocessing-CNN methodology — the 8-stage pipeline, the CNN architectures (ResNet-50, EfficientNet-B3), the pretraining strategy, and the multi-metric evaluation framework (Chapter 3).</w:t>
+        <w:t>To evaluate the framework experimentally through eight investigations conducted on a common substrate — integrated-pipeline dominance under a 2×2 factorial design (Experiment 1); cumulative component ablation with the CLAHE and flat-field parameter sweeps (Experiment 2); direct measurement of source-to-target distance in feature space across six external corpora; cross-dataset transferability (Experiment 3); Grad-CAM explainability against expert lesion annotation (Experiment 4); external clinical performance (Experiment 5); device domain shift (Experiment 6); and training in a data-scarce regime (Experiment 7) — together with the statistical validation, the comparative placement of the results, and the limitations and boundary conditions of the approach (Chapter 3).</w:t>
       </w:r>
     </w:p>
     <w:p>
@@ -299,43 +299,7 @@
         </w:rPr>
         <w:t>4.</w:t>
         <w:tab/>
-        <w:t>To experimentally validate the integrated pipeline through eight investigations conducted on a common substrate: integrated-pipeline dominance (Experiment 1, H-1); component ablation with the CLAHE and flat-field parameter sweeps (Experiment 2, H-2); direct measurement of source-to-target distance in feature space across six external corpora (H-3); cross-dataset transferability (Experiment 3, H-4); Grad-CAM explainability (Experiment 4, H-5); external clinical performance (Experiment 5, H-7); device domain shift (Experiment 6, H-6); and small-data training (Experiment 7) (Chapter 4).</w:t>
-      </w:r>
-    </w:p>
-    <w:p>
-      <w:pPr>
-        <w:ind w:left="709" w:hanging="397"/>
-        <w:jc w:val="both"/>
-      </w:pPr>
-      <w:r>
-        <w:rPr>
-          <w:rFonts w:ascii="Times New Roman" w:hAnsi="Times New Roman" w:cs="Times New Roman" w:eastAsia="Times New Roman"/>
-          <w:b w:val="0"/>
-          <w:i w:val="0"/>
-          <w:sz w:val="28"/>
-          <w:u w:val="none"/>
-        </w:rPr>
-        <w:t>5.</w:t>
-        <w:tab/>
-        <w:t>To validate the reliability of the results through statistical analysis and comparative benchmarking, and to state the limitations and boundary conditions of the approach (Chapter 5).</w:t>
-      </w:r>
-    </w:p>
-    <w:p>
-      <w:pPr>
-        <w:ind w:left="709" w:hanging="397"/>
-        <w:jc w:val="both"/>
-      </w:pPr>
-      <w:r>
-        <w:rPr>
-          <w:rFonts w:ascii="Times New Roman" w:hAnsi="Times New Roman" w:cs="Times New Roman" w:eastAsia="Times New Roman"/>
-          <w:b w:val="0"/>
-          <w:i w:val="0"/>
-          <w:sz w:val="28"/>
-          <w:u w:val="none"/>
-        </w:rPr>
-        <w:t>6.</w:t>
-        <w:tab/>
-        <w:t>To design an architecture for an automated DR screening system suitable for resource-limited environments, with telemedicine and eHealth integration applicable to Kazakhstan healthcare infrastructure (Chapter 6).</w:t>
+        <w:t>To build and describe a screening system around the model, suited to settings without inference acceleration and with intermittent connectivity, with telemedicine and eHealth integration applicable to Kazakhstan healthcare infrastructure, and to state what of it exists and what remains specification (Chapter 4).</w:t>
       </w:r>
     </w:p>
     <w:p>
@@ -700,7 +664,7 @@
         </w:rPr>
         <w:t>12.</w:t>
         <w:tab/>
-        <w:t>Two contributions are non-empirical by design: the coupled thermal-optical model of fundus tissue response under laser exposure, a theoretical and computational contribution only; and the modular screening-system architecture, a design contribution only — no prototype implemented, no field testing conducted.</w:t>
+        <w:t>Two contributions are non-empirical by design: the coupled thermal-optical model of fundus tissue response under laser exposure, a theoretical and computational contribution only; and the modular screening-system architecture, a design contribution realised in part as a working demonstrator, which establishes realisability and operating behaviour and is evidence for no diagnostic claim — no clinical deployment testing conducted.</w:t>
       </w:r>
     </w:p>
     <w:p>
@@ -771,7 +735,7 @@
         </w:rPr>
         <w:t>3.</w:t>
         <w:tab/>
-        <w:t>The dominance of the integrated configuration over the baseline was established under a controlled 2×2 factorial design (configurations A–D) on EyePACS for both ResNet-50 and EfficientNet-B3: the pre-registered criterion was satisfied in all three of its components, the effect survived correction for multiple comparisons, and showed no interaction with the choice of architecture (Experiment 1, H-1 supported). It is a property of the configuration, which differs from the baseline in initialisation as well as in preprocessing.</w:t>
+        <w:t>The dominance of the integrated configuration over the baseline was established under a controlled 2×2 factorial design (configurations A–D) on EyePACS for both ResNet-50 and EfficientNet-B3: the pre-registered criterion was satisfied in all three of its components, the effect survived correction for multiple comparisons, and showed no interaction with the choice of architecture (Experiment 1). It is a property of the configuration, which differs from the baseline in initialisation as well as in preprocessing.</w:t>
       </w:r>
     </w:p>
     <w:p>
@@ -789,7 +753,7 @@
         </w:rPr>
         <w:t>4.</w:t>
         <w:tab/>
-        <w:t>The contribution of the individual pipeline stages was quantified through a cumulative component ablation under a single initialisation: every stage transition contributed more than the between-fold dispersion of its level, the contributions separate into groups with the two photometric stages leading, and the ablation recovered the whole in-domain gain. The CLAHE clip limit and the flat-field σ each exhibited an interior optimum within the ranges swept, confirmed on held-out data and supported by image-quality metrics (CNR, entropy, SSIM) (Experiment 2, H-2 supported).</w:t>
+        <w:t>The contribution of the individual pipeline stages was quantified through a cumulative component ablation under a single initialisation: every stage transition contributed more than the between-fold dispersion of its level, the contributions separate into groups with the two photometric stages leading, and the ablation recovered the whole in-domain gain. The CLAHE clip limit and the flat-field σ each exhibited an interior optimum within the ranges swept, confirmed on held-out data and supported by image-quality metrics (CNR, entropy, SSIM) (Experiment 2).</w:t>
       </w:r>
     </w:p>
     <w:p>
@@ -807,7 +771,7 @@
         </w:rPr>
         <w:t>5.</w:t>
         <w:tab/>
-        <w:t>The reduction of source-to-target distance in feature space was measured directly across six external corpora under a mandatory source-domain-statistics condition: the distance fell on every corpus examined, supplying the middle term of the causal chain that the remaining hypotheses approach only through its consequence (H-3 supported, in direction only).</w:t>
+        <w:t>The reduction of source-to-target distance in feature space was measured directly across six external corpora under a mandatory source-domain-statistics condition: the distance fell on every corpus examined, supplying the middle term of the causal chain that the remaining investigations approach only through its consequence — in direction only, since the magnitude of a distance reduction does not track the magnitude of any performance gain.</w:t>
       </w:r>
     </w:p>
     <w:p>
@@ -825,7 +789,7 @@
         </w:rPr>
         <w:t>6.</w:t>
         <w:tab/>
-        <w:t>A model trained on EyePACS with the pipeline transferred to APTOS 2019 without retraining, clearing the pre-registered generalisation ratio G ≥ 0.85 and exceeding the baseline on every grade; the baseline also cleared the threshold, so the evidence lies in the comparison rather than in the criterion (Experiment 3, H-4 supported).</w:t>
+        <w:t>A model trained on EyePACS with the pipeline transferred to APTOS 2019 without retraining, clearing the pre-registered generalisation ratio G ≥ 0.85 and exceeding the baseline on every grade; the baseline also cleared the threshold, so the evidence lies in the comparison rather than in the criterion (Experiment 3).</w:t>
       </w:r>
     </w:p>
     <w:p>
@@ -843,7 +807,7 @@
         </w:rPr>
         <w:t>7.</w:t>
         <w:tab/>
-        <w:t>Grad-CAM explainability analysis, using the proposed Attention–Lesion Overlap (ALO, primary) and IoU (secondary) against IDRiD pixel-level lesion masks, found model attention more closely aligned with expert annotation under the integrated configuration, on all four annotated lesion types and both measures (Experiment 4, H-5 supported in its quantitative half only).</w:t>
+        <w:t>Grad-CAM explainability analysis, using the proposed Attention–Lesion Overlap (ALO, primary) and IoU (secondary) against IDRiD pixel-level lesion masks, found model attention more closely aligned with expert annotation under the integrated configuration, on all four annotated lesion types and both measures (Experiment 4); the qualitative examination on the clinical corpus was not carried out.</w:t>
       </w:r>
     </w:p>
     <w:p>
@@ -861,7 +825,7 @@
         </w:rPr>
         <w:t>8.</w:t>
         <w:tab/>
-        <w:t>On both external clinical corpora the integrated configuration attained higher absolute weighted F1, each difference reaching the minimal clinically important difference with its interval excluding zero (Experiment 5, H-7 supported as absolute external performance, not as resistance to degradation); performance was maintained across all five camera groupings with their dispersion reduced (Experiment 6, H-6 supported); and in the data-scarce regime the integrated configuration was again the stronger, by a margin comparable to, and not larger than, the one measured with abundant data (Experiment 7).</w:t>
+        <w:t>On both external clinical corpora the integrated configuration attained higher absolute weighted F1, each difference reaching the minimal clinically important difference with its interval excluding zero (Experiment 5 — higher absolute external performance, not resistance to degradation); performance was maintained across all five camera groupings with their dispersion reduced (Experiment 6); and in the data-scarce regime the integrated configuration was again the stronger, by a margin comparable to, and not larger than, the one measured with abundant data (Experiment 7).</w:t>
       </w:r>
     </w:p>
     <w:p>
@@ -879,7 +843,7 @@
         </w:rPr>
         <w:t>9.</w:t>
         <w:tab/>
-        <w:t>A modular architecture for an automated DR screening system suitable for resource-limited environments, with telemedicine and eHealth integration applicable to Kazakhstan healthcare infrastructure, was designed as a design specification; no prototype was implemented and no field testing was conducted.</w:t>
+        <w:t>A modular architecture for an automated DR screening system suitable for resource-limited environments, with telemedicine and eHealth integration applicable to Kazakhstan healthcare infrastructure, was designed, and a working demonstrator of it was built and deployed: it runs the preprocessing pipeline and the trained classifier end to end, produces attention maps, and keeps a per-case record including the reviewing ophthalmologist's verdict. The demonstrator establishes that the design is realisable and what it does in operation; the deployment-oriented parts it does not realise remain specification, and no clinical deployment testing was conducted.</w:t>
       </w:r>
     </w:p>
     <w:p>
@@ -958,7 +922,7 @@
         </w:rPr>
         <w:t>2.</w:t>
         <w:tab/>
-        <w:t xml:space="preserve">The integrated configuration dominates the baseline configuration in five-class DR classification on EyePACS, on both ResNet-50 and EfficientNet-B3, under the conjunctive pre-registered criterion in all three of its components, with the effect surviving correction for multiple comparisons and showing no interaction with the choice of architecture (H-1). </w:t>
+        <w:t xml:space="preserve">The integrated configuration dominates the baseline configuration in five-class DR classification on EyePACS, on both ResNet-50 and EfficientNet-B3, under the conjunctive pre-registered criterion in all three of its components, with the effect surviving correction for multiple comparisons and showing no interaction with the choice of architecture. </w:t>
       </w:r>
       <w:r>
         <w:rPr>
@@ -986,7 +950,7 @@
         </w:rPr>
         <w:t>3.</w:t>
         <w:tab/>
-        <w:t xml:space="preserve">The dual-constraint CLAHE parameters and the flat-field σ each exhibit an interior optimum within the ranges examined, confirmed on held-out data (H-2). </w:t>
+        <w:t xml:space="preserve">The dual-constraint CLAHE parameters and the flat-field σ each exhibit an interior optimum within the ranges examined, confirmed on held-out data. </w:t>
       </w:r>
       <w:r>
         <w:rPr>
@@ -1014,7 +978,7 @@
         </w:rPr>
         <w:t>4.</w:t>
         <w:tab/>
-        <w:t xml:space="preserve">The contributions of the individual pipeline stages are separable, monotone across folds, and orderable with the two photometric stages leading (H-2). </w:t>
+        <w:t xml:space="preserve">The contributions of the individual pipeline stages are separable, monotone across folds, and orderable with the two photometric stages leading. </w:t>
       </w:r>
       <w:r>
         <w:rPr>
@@ -1042,7 +1006,7 @@
         </w:rPr>
         <w:t>5.</w:t>
         <w:tab/>
-        <w:t xml:space="preserve">The integrated configuration reduces the distance between the training distribution and each external distribution in penultimate-layer feature space, on every external corpus examined, without any target-corpus statistic entering the transform (H-3). </w:t>
+        <w:t xml:space="preserve">The integrated configuration reduces the distance between the training distribution and each external distribution in penultimate-layer feature space, on every external corpus examined, without any target-corpus statistic entering the transform. </w:t>
       </w:r>
       <w:r>
         <w:rPr>
@@ -1070,7 +1034,7 @@
         </w:rPr>
         <w:t>6.</w:t>
         <w:tab/>
-        <w:t xml:space="preserve">A model trained on EyePACS with the pipeline transfers to APTOS 2019 without retraining, clearing the pre-registered generalisation ratio G ≥ 0.85 and exceeding the baseline on every grade (H-4). </w:t>
+        <w:t xml:space="preserve">A model trained on EyePACS with the pipeline transfers to APTOS 2019 without retraining, clearing the pre-registered generalisation ratio G ≥ 0.85 and exceeding the baseline on every grade. </w:t>
       </w:r>
       <w:r>
         <w:rPr>
@@ -1098,7 +1062,7 @@
         </w:rPr>
         <w:t>7.</w:t>
         <w:tab/>
-        <w:t xml:space="preserve">Model attention aligns more closely with expert pixel-level lesion annotation under the integrated configuration, on all four annotated lesion types, on both the primary and the secondary measure, and robustly across the attention threshold (H-5). </w:t>
+        <w:t xml:space="preserve">Model attention aligns more closely with expert pixel-level lesion annotation under the integrated configuration, on all four annotated lesion types, on both the primary and the secondary measure, and robustly across the attention threshold. </w:t>
       </w:r>
       <w:r>
         <w:rPr>
@@ -1126,7 +1090,7 @@
         </w:rPr>
         <w:t>8.</w:t>
         <w:tab/>
-        <w:t xml:space="preserve">Classification performance is maintained across every camera grouping examined and, substantively, the dispersion of performance across those groupings is reduced (H-6). </w:t>
+        <w:t xml:space="preserve">Classification performance is maintained across every camera grouping examined and, substantively, the dispersion of performance across those groupings is reduced. </w:t>
       </w:r>
       <w:r>
         <w:rPr>
@@ -1154,7 +1118,7 @@
         </w:rPr>
         <w:t>9.</w:t>
         <w:tab/>
-        <w:t xml:space="preserve">The integrated configuration attains higher absolute weighted F1 than the baseline on both external clinical corpora, each difference reaching the minimal clinically important difference with its confidence interval excluding zero, evaluated on each corpus separately (H-7). </w:t>
+        <w:t xml:space="preserve">The integrated configuration attains higher absolute weighted F1 than the baseline on both external clinical corpora, each difference reaching the minimal clinically important difference with its confidence interval excluding zero, evaluated on each corpus separately. </w:t>
       </w:r>
       <w:r>
         <w:rPr>
@@ -1210,7 +1174,7 @@
         </w:rPr>
         <w:t>11.</w:t>
         <w:tab/>
-        <w:t xml:space="preserve">A coupled thermal-optical model of fundus tissue response under laser exposure, and a modular architecture for an automated DR screening system in resource-limited environments. </w:t>
+        <w:t xml:space="preserve">A coupled thermal-optical model of fundus tissue response under laser exposure, and a modular architecture for an automated DR screening system in resource-limited environments, realised in part as a working demonstrator. </w:t>
       </w:r>
       <w:r>
         <w:rPr>
@@ -1220,7 +1184,7 @@
           <w:sz w:val="28"/>
           <w:u w:val="none"/>
         </w:rPr>
-        <w:t>Submitted as theoretical and design contributions respectively — the model is not clinically validated, and the architecture was neither prototyped nor field-tested.</w:t>
+        <w:t>Submitted as theoretical and design contributions respectively — the model is not clinically validated; the demonstrator establishes realisability and operating behaviour and is evidence for no diagnostic claim; the deployment-oriented parts of the architecture remain specification, and no field testing was conducted.</w:t>
       </w:r>
     </w:p>
     <w:p>
@@ -1374,17 +1338,7 @@
           <w:sz w:val="28"/>
           <w:u w:val="none"/>
         </w:rPr>
-        <w:t xml:space="preserve">A modular automated DR screening system architecture is proposed, with preprocessing-engine, inference, store-and-forward telemedicine, and physician-in-the-loop decision-support modules, integrable with PACS/EHR systems and the national eHealth platform, and applicable to DR screening in rural and underserved regions of Kazakhstan. It is a design specification: no prototype was implemented, no deployment was tested clinically, and its data-protection provisions are alignment by design rather than certified compliance. The system is conceived as decision support in which the clinician retains the diagnosis and the responsibility for it; nothing here is offered as a standalone diagnostic instrument. </w:t>
-      </w:r>
-      <w:r>
-        <w:rPr>
-          <w:rFonts w:ascii="Times New Roman" w:hAnsi="Times New Roman" w:cs="Times New Roman" w:eastAsia="Times New Roman"/>
-          <w:b w:val="0"/>
-          <w:i/>
-          <w:sz w:val="28"/>
-          <w:u w:val="none"/>
-        </w:rPr>
-        <w:t>(The publication and approbation record is given in Appendix D.)</w:t>
+        <w:t>A modular automated DR screening system architecture is proposed, with preprocessing-engine, inference, store-and-forward telemedicine, and physician-in-the-loop decision-support modules, integrable with PACS/EHR systems and the national eHealth platform, and applicable to DR screening in rural and underserved regions of Kazakhstan. A working demonstrator of the architecture is deployed and performs inference on submitted images, which establishes that the design is realisable and what it does in operation; the deployment-oriented parts it does not realise — PACS integration, EHR interoperability, telemedicine operation — remain design specifications, no deployment was tested clinically, and the data-protection provisions are alignment by design rather than certified compliance. The system is conceived as decision support in which the clinician retains the diagnosis and the responsibility for it; nothing here is offered as a standalone diagnostic instrument.</w:t>
       </w:r>
     </w:p>
     <w:p>
@@ -1450,7 +1404,7 @@
           <w:sz w:val="28"/>
           <w:u w:val="none"/>
         </w:rPr>
-        <w:t>The results of the research were reported and discussed at international scientific forums, including the 3rd International Workshop on Digital Society (DS 2025, Istanbul, Türkiye, 28–30 October 2025), and published in international peer-reviewed journals. The documentary record is reproduced in Appendix D.</w:t>
+        <w:t>The results of the research were reported and discussed at international scientific forums, including the 3rd International Workshop on Digital Society (DS 2025, Istanbul, Türkiye, 28–30 October 2025), and published in international peer-reviewed journals; the five works are listed below.</w:t>
       </w:r>
     </w:p>
     <w:p>
@@ -1812,7 +1766,7 @@
           <w:sz w:val="28"/>
           <w:u w:val="none"/>
         </w:rPr>
-        <w:t>Chapter 1 — "Problem Domain Analysis and Current State of Automated Diabetic Retinopathy Diagnosis"</w:t>
+        <w:t>Chapter 1 — "Automated diabetic retinopathy screening"</w:t>
       </w:r>
       <w:r>
         <w:rPr>
@@ -1822,7 +1776,7 @@
           <w:sz w:val="28"/>
           <w:u w:val="none"/>
         </w:rPr>
-        <w:t xml:space="preserve"> examines the medical and epidemiological context of DR and its clinical grading, the screening requirements of resource-limited settings, the sources of fundus image quality degradation and device-specific variability, deep-learning approaches to retinal image classification (CNN architectures, transfer and self-supervised pretraining, explainability), and provides a critical analysis of existing automated DR screening systems, concluding with the formulation of the research problem and the justification of the research direction.</w:t>
+        <w:t xml:space="preserve"> establishes the clinical and technical context of screening: the ordinal five-class grading of the disease and the clinical cost of a misgrading, the screening requirements of resource-limited settings, the physics of laser coagulation as bounded theoretical context for referral, the sources of fundus image quality loss and its device-specific component, what the field has achieved with convolutional networks (architectures, transfer and self-supervised pretraining, explainability), and a critical analysis of existing automated screening systems and the conditions that bound their reported figures, concluding with the formulation of the research problem and the justification of the research direction.</w:t>
       </w:r>
     </w:p>
     <w:p>
@@ -1838,7 +1792,7 @@
           <w:sz w:val="28"/>
           <w:u w:val="none"/>
         </w:rPr>
-        <w:t>Chapter 2 — "Theoretical Foundations of Image Preprocessing and Deep Learning for Fundus Image Analysis"</w:t>
+        <w:t>Chapter 2 — "Methodology of the integrated pipeline"</w:t>
       </w:r>
       <w:r>
         <w:rPr>
@@ -1848,7 +1802,7 @@
           <w:sz w:val="28"/>
           <w:u w:val="none"/>
         </w:rPr>
-        <w:t xml:space="preserve"> establishes the mathematical foundations of image enhancement (histogram equalisation, dual-constraint CLAHE, spatial filtering), the theoretical framework of CNNs (convolution, pooling, loss functions for imbalanced data, regularisation), transfer and in-domain self-supervised representation learning, the mathematical modelling of laser-tissue interaction in retinal therapy, explainability (CAM, Grad-CAM, ALO, IoU), and image quality metrics for preprocessing evaluation.</w:t>
+        <w:t xml:space="preserve"> specifies the integrated methodology. It formalises the 8-stage preprocessing pipeline stage by stage together with the theoretical foundations of each — canonical orientation and landmark-based rotation normalisation, isotropic resize with centred padding, the field-of-view mask as a fourth input channel, adaptive flat-field correction scaled to per-image geometry, and the dual-constraint clip limit of the CLAHE stage, formalised as the minimum of a histogram-relative and a tile-relative constraint and applied stochastically at training time. It then specifies the classification architectures (ResNet-50 and EfficientNet-B3) and their adaptation to five-class grading with the weighted (Focal) loss, the pretraining and fine-tuning strategy with its frozen-backbone linear-probe acceptance gate, the explainability formalism (Grad-CAM, the Attention–Lesion Overlap metric, IoU) with the image-quality measures, and the evaluation hierarchy and statistical protocol.</w:t>
       </w:r>
     </w:p>
     <w:p>
@@ -1864,7 +1818,7 @@
           <w:sz w:val="28"/>
           <w:u w:val="none"/>
         </w:rPr>
-        <w:t>Chapter 3 — "Methodology of Integrated Preprocessing-CNN Pipeline Design"</w:t>
+        <w:t>Chapter 3 — "Experimental results"</w:t>
       </w:r>
       <w:r>
         <w:rPr>
@@ -1874,7 +1828,7 @@
           <w:sz w:val="28"/>
           <w:u w:val="none"/>
         </w:rPr>
-        <w:t xml:space="preserve"> formalises the unified 8-stage preprocessing pipeline and the modified dual-constraint CLAHE algorithm, the augmentation strategy, and the external image ingestion protocol; specifies the CNN architectures (ResNet-50 and EfficientNet-B3); details the transfer-learning and ophthalmology-specific self-supervised pretraining methodology, the architecture adaptation for five-class classification, and the weighted (Focal) loss formulation; and defines the multi-metric evaluation and statistical reliability framework.</w:t>
+        <w:t xml:space="preserve"> reports the experimental programme on the tiered corpus: the datasets and experimental configuration; the effect of the pipeline on accuracy under the 2×2 factorial design (Experiment 1); the cumulative stage ablation with the CLAHE clip-limit and flat-field σ sweeps (Experiment 2); the direct measurement of source-to-target distance in penultimate-layer feature space across six external corpora; cross-dataset transfer to APTOS 2019 and external clinical evaluation on IDRiD and Messidor-2 (Experiments 3 and 5), with behaviour across camera groupings (Experiment 6); the agreement of attention maps with expert pixel-level lesion annotation (Experiment 4); training on small clinical samples (Experiment 7); and the statistical validation and the comparative placement of the results against published systems without ranking among them, closing with the limitations and boundary conditions of the approach.</w:t>
       </w:r>
     </w:p>
     <w:p>
@@ -1890,7 +1844,7 @@
           <w:sz w:val="28"/>
           <w:u w:val="none"/>
         </w:rPr>
-        <w:t>Chapter 4 — "Experimental Research — Preprocessing Impact on CNN Diagnostic Performance"</w:t>
+        <w:t>Chapter 4 — "The screening system"</w:t>
       </w:r>
       <w:r>
         <w:rPr>
@@ -1900,59 +1854,7 @@
           <w:sz w:val="28"/>
           <w:u w:val="none"/>
         </w:rPr>
-        <w:t xml:space="preserve"> presents the tiered dataset architecture and eight investigations: Experiment 1 (integrated-pipeline dominance via a restored 2×2 factorial, configs A–D), Experiment 2 (cumulative stage ablation, CLAHE threshold and flat-field σ sweeps with image-quality metrics), the direct measurement of source-to-target domain distance across six external corpora (H-3), Experiment 3 (zero-shot cross-dataset transfer to APTOS 2019), Experiment 4 (Grad-CAM explainability with quantitative ALO/IoU on IDRiD), Experiment 5 (external clinical performance on IDRiD and Messidor-2), Experiment 6 (device domain shift on DDR, ODIR-5K, RFMiD), and Experiment 7 (small-data training on IDRiD with the Clinical dataset held out).</w:t>
-      </w:r>
-    </w:p>
-    <w:p>
-      <w:pPr>
-        <w:ind w:firstLine="709"/>
-        <w:jc w:val="both"/>
-      </w:pPr>
-      <w:r>
-        <w:rPr>
-          <w:rFonts w:ascii="Times New Roman" w:hAnsi="Times New Roman" w:cs="Times New Roman" w:eastAsia="Times New Roman"/>
-          <w:b/>
-          <w:i w:val="0"/>
-          <w:sz w:val="28"/>
-          <w:u w:val="none"/>
-        </w:rPr>
-        <w:t>Chapter 5 — "Reliability Validation and Comparative Analysis"</w:t>
-      </w:r>
-      <w:r>
-        <w:rPr>
-          <w:rFonts w:ascii="Times New Roman" w:hAnsi="Times New Roman" w:cs="Times New Roman" w:eastAsia="Times New Roman"/>
-          <w:b w:val="0"/>
-          <w:i w:val="0"/>
-          <w:sz w:val="28"/>
-          <w:u w:val="none"/>
-        </w:rPr>
-        <w:t xml:space="preserve"> consolidates the explainability results, the statistical validation (bootstrap confidence intervals and mixed-effects modelling, final claim-strength classifications), the placement of the work against published systems without ranking it among them, and the performance–complexity trade-off, and states the limitations and boundary conditions of the proposed approach.</w:t>
-      </w:r>
-    </w:p>
-    <w:p>
-      <w:pPr>
-        <w:ind w:firstLine="709"/>
-        <w:jc w:val="both"/>
-      </w:pPr>
-      <w:r>
-        <w:rPr>
-          <w:rFonts w:ascii="Times New Roman" w:hAnsi="Times New Roman" w:cs="Times New Roman" w:eastAsia="Times New Roman"/>
-          <w:b/>
-          <w:i w:val="0"/>
-          <w:sz w:val="28"/>
-          <w:u w:val="none"/>
-        </w:rPr>
-        <w:t>Chapter 6 — "Architecture of an Automated DR Screening System for Resource-Limited Environments"</w:t>
-      </w:r>
-      <w:r>
-        <w:rPr>
-          <w:rFonts w:ascii="Times New Roman" w:hAnsi="Times New Roman" w:cs="Times New Roman" w:eastAsia="Times New Roman"/>
-          <w:b w:val="0"/>
-          <w:i w:val="0"/>
-          <w:sz w:val="28"/>
-          <w:u w:val="none"/>
-        </w:rPr>
-        <w:t xml:space="preserve"> specifies the functional and non-functional requirements, the modular architecture with PACS and EHR integration, the AI processing module (configurable preprocessing engine and inference module), clinical workflow integration (telemedicine, portable-device and national eHealth-platform support, physician-in-the-loop decision support), and the data security and regulatory-compliance framework (GDPR/HIPAA-aligned), with its applicability to Kazakhstan healthcare infrastructure.</w:t>
+        <w:t xml:space="preserve"> describes the screening system built around the model, distinguishing throughout what was realised from what remains specification: the modular architecture and its modules, the preprocessing and inference services with their interface, the clinical workflow and the operator interface in which the ophthalmologist reviews and records a verdict, and the deployment envelope and data-protection framework (GDPR/HIPAA-aligned by design), with the applicability to Kazakhstan healthcare infrastructure bounded by the absence of field testing there.</w:t>
       </w:r>
     </w:p>
     <w:p>
@@ -2018,7 +1920,7 @@
           <w:sz w:val="28"/>
           <w:u w:val="none"/>
         </w:rPr>
-        <w:t>The dissertation consists of front matter — normative references, definitions, and designations and abbreviations — followed by an introduction, six chapters, a conclusion, a list of references used, and six appendices (A–F): the source code of the preprocessing pipeline, supplementary experimental results and confusion matrices, the system-architecture diagrams, the publication and approbation record, the attention-map gallery, and supplementary tables for the device-domain evaluation.</w:t>
+        <w:t>The dissertation consists of front matter — normative references, definitions, and designations and abbreviations — followed by an introduction, four chapters, a conclusion, a list of references used, and five appendices (A–E): the source code of the preprocessing pipeline, supplementary experimental results and confusion matrices, the system-architecture diagrams, the attention-map gallery, and supplementary tables for the device-domain evaluation.</w:t>
       </w:r>
     </w:p>
     <w:p>
@@ -2034,7 +1936,7 @@
           <w:sz w:val="28"/>
           <w:u w:val="none"/>
         </w:rPr>
-        <w:t>The dissertation is set out on 265 pages, and contains 42 tables, 26 figures and two diagrams. The list of references comprises 107 sources. The counts are of the dissertation excluding the appendices.</w:t>
+        <w:t>The dissertation is set out on 117 pages, and contains 19 tables and 16 figures. The list of references comprises 99 sources. The counts are of the dissertation excluding the appendices.</w:t>
       </w:r>
     </w:p>
     <w:sectPr>

</xml_diff>

<commit_message>
Rewrite the abstracts to corpus form and teach md2gost the masthead
The three abstracts (EN/KZ/RU) are rebuilt as continuous GOST prose in the
shape the sample corpus uses, replacing the heading-and-section layout.
md2gost gains the pieces that shape needs: a centred, unindented masthead
closed by one empty line, and `<!-- runlist -->` for publication lists set
as ordinary numbered body paragraphs. check_metadata now strips emphasis
markers before matching, so a registry value split across bold runs is read
correctly and a forbidden form cannot hide inside one.

Also drops the superseded dated GOST builds (2026-08-13 through 08-22) from
defense/docs and records the peer annotation norms in PROJECT_MEMORY.

Co-Authored-By: Claude Opus 5 <noreply@anthropic.com>
Claude-Session: https://claude.ai/code/session_01BC99eBCDuHk8HfYDeZCEvV
</commit_message>
<xml_diff>
--- a/defense/docs/abstracts/abstract_en.docx
+++ b/defense/docs/abstracts/abstract_en.docx
@@ -21,6 +21,97 @@
     </w:p>
     <w:p>
       <w:pPr>
+        <w:spacing w:after="0" w:before="0"/>
+        <w:ind w:firstLine="0"/>
+        <w:jc w:val="center"/>
+      </w:pPr>
+      <w:r>
+        <w:rPr>
+          <w:rFonts w:ascii="Times New Roman" w:hAnsi="Times New Roman" w:cs="Times New Roman" w:eastAsia="Times New Roman"/>
+          <w:b/>
+          <w:i w:val="0"/>
+          <w:sz w:val="28"/>
+          <w:u w:val="none"/>
+        </w:rPr>
+        <w:t>of the PhD thesis by Yesmukhamedov Nurmaganbet Seitkaliuly on</w:t>
+      </w:r>
+    </w:p>
+    <w:p>
+      <w:pPr>
+        <w:spacing w:after="0" w:before="0"/>
+        <w:ind w:firstLine="0"/>
+        <w:jc w:val="center"/>
+      </w:pPr>
+      <w:r>
+        <w:rPr>
+          <w:rFonts w:ascii="Times New Roman" w:hAnsi="Times New Roman" w:cs="Times New Roman" w:eastAsia="Times New Roman"/>
+          <w:b/>
+          <w:i w:val="0"/>
+          <w:sz w:val="28"/>
+          <w:u w:val="none"/>
+        </w:rPr>
+        <w:t>«Computer System for Processing and Analysis of Eye Data to Support</w:t>
+      </w:r>
+    </w:p>
+    <w:p>
+      <w:pPr>
+        <w:spacing w:after="0" w:before="0"/>
+        <w:ind w:firstLine="0"/>
+        <w:jc w:val="center"/>
+      </w:pPr>
+      <w:r>
+        <w:rPr>
+          <w:rFonts w:ascii="Times New Roman" w:hAnsi="Times New Roman" w:cs="Times New Roman" w:eastAsia="Times New Roman"/>
+          <w:b/>
+          <w:i w:val="0"/>
+          <w:sz w:val="28"/>
+          <w:u w:val="none"/>
+        </w:rPr>
+        <w:t>Laser Coagulation in the Treatment of Diabetic Retinopathy», submitted</w:t>
+      </w:r>
+    </w:p>
+    <w:p>
+      <w:pPr>
+        <w:spacing w:after="0" w:before="0"/>
+        <w:ind w:firstLine="0"/>
+        <w:jc w:val="center"/>
+      </w:pPr>
+      <w:r>
+        <w:rPr>
+          <w:rFonts w:ascii="Times New Roman" w:hAnsi="Times New Roman" w:cs="Times New Roman" w:eastAsia="Times New Roman"/>
+          <w:b/>
+          <w:i w:val="0"/>
+          <w:sz w:val="28"/>
+          <w:u w:val="none"/>
+        </w:rPr>
+        <w:t>for the degree of Doctor of Philosophy (PhD) in the educational</w:t>
+      </w:r>
+    </w:p>
+    <w:p>
+      <w:pPr>
+        <w:spacing w:after="0" w:before="0"/>
+        <w:ind w:firstLine="0"/>
+        <w:jc w:val="center"/>
+      </w:pPr>
+      <w:r>
+        <w:rPr>
+          <w:rFonts w:ascii="Times New Roman" w:hAnsi="Times New Roman" w:cs="Times New Roman" w:eastAsia="Times New Roman"/>
+          <w:b/>
+          <w:i w:val="0"/>
+          <w:sz w:val="28"/>
+          <w:u w:val="none"/>
+        </w:rPr>
+        <w:t>programme 8D06102 — Computer and Software Engineering</w:t>
+      </w:r>
+    </w:p>
+    <w:p>
+      <w:pPr>
+        <w:spacing w:before="0" w:after="0"/>
+        <w:ind w:firstLine="0"/>
+      </w:pPr>
+    </w:p>
+    <w:p>
+      <w:pPr>
         <w:ind w:firstLine="709"/>
         <w:jc w:val="both"/>
       </w:pPr>
@@ -32,31 +123,17 @@
           <w:sz w:val="28"/>
           <w:u w:val="none"/>
         </w:rPr>
-        <w:t>of the PhD thesis by Yesmukhamedov Nurmaganbet Seitkaliuly on «Computer System for Processing and Analysis of Eye Data to Support Laser Coagulation in the Treatment of Diabetic Retinopathy», submitted for the degree of Doctor of Philosophy (PhD) in the educational programme (EP) 8D06102 — Computer and Software Engineering</w:t>
+        <w:t>General characteristics of the work.</w:t>
       </w:r>
-    </w:p>
-    <w:p>
-      <w:pPr>
-        <w:pBdr>
-          <w:bottom w:val="single" w:sz="6" w:space="1" w:color="auto"/>
-        </w:pBdr>
-      </w:pPr>
-    </w:p>
-    <w:p>
-      <w:pPr>
-        <w:keepNext/>
-        <w:spacing w:before="240" w:after="120"/>
-        <w:jc w:val="left"/>
-      </w:pPr>
       <w:r>
         <w:rPr>
           <w:rFonts w:ascii="Times New Roman" w:hAnsi="Times New Roman" w:cs="Times New Roman" w:eastAsia="Times New Roman"/>
-          <w:b/>
+          <w:b w:val="0"/>
           <w:i w:val="0"/>
           <w:sz w:val="28"/>
           <w:u w:val="none"/>
         </w:rPr>
-        <w:t>General characteristics of the research</w:t>
+        <w:t xml:space="preserve"> The dissertation investigates and formalises the integration of fundus image enhancement (preprocessing) with convolutional-neural-network (CNN) classification for automated multi-stage diagnosis of diabetic retinopathy (DR). Its central idea is that preprocessing is an integral component of the diagnostic model rather than ancillary data preparation, because it defines the feature space available to the network. To operationalise it, an 8-stage preprocessing pipeline is specified and embedded in the model, and its effect is placed under controlled contrast against an equivalent baseline configuration trained without the pipeline, on eight public and clinical fundus datasets.</w:t>
       </w:r>
     </w:p>
     <w:p>
@@ -67,29 +144,22 @@
       <w:r>
         <w:rPr>
           <w:rFonts w:ascii="Times New Roman" w:hAnsi="Times New Roman" w:cs="Times New Roman" w:eastAsia="Times New Roman"/>
+          <w:b/>
+          <w:i w:val="0"/>
+          <w:sz w:val="28"/>
+          <w:u w:val="none"/>
+        </w:rPr>
+        <w:t>Relevance of the research.</w:t>
+      </w:r>
+      <w:r>
+        <w:rPr>
+          <w:rFonts w:ascii="Times New Roman" w:hAnsi="Times New Roman" w:cs="Times New Roman" w:eastAsia="Times New Roman"/>
           <w:b w:val="0"/>
           <w:i w:val="0"/>
           <w:sz w:val="28"/>
           <w:u w:val="none"/>
         </w:rPr>
-        <w:t>This dissertation investigates and formalises the integration of fundus image enhancement (preprocessing) with convolutional-neural-network (CNN) classification for automated multi-stage diabetic retinopathy (DR) diagnosis. Its central idea is that preprocessing is an integral component of the diagnostic model rather than ancillary data preparation, because it defines the feature space available to the network. To operationalise this idea, an 8-stage preprocessing pipeline is specified and embedded in the model, and its effect is placed under a controlled experimental contrast against an equivalent baseline trained without the pipeline. The approach is validated across eight public and clinical fundus datasets acquired with cameras of four manufacturers, covering diagnostic dominance, component ablation, direct measurement of domain-shift reduction, cross-dataset transfer, explainability, external clinical performance, and device domain shift, and is oriented towards automated DR screening in resource-limited settings, including the healthcare infrastructure of Kazakhstan.</w:t>
-      </w:r>
-    </w:p>
-    <w:p>
-      <w:pPr>
-        <w:keepNext/>
-        <w:spacing w:before="240" w:after="120"/>
-        <w:jc w:val="left"/>
-      </w:pPr>
-      <w:r>
-        <w:rPr>
-          <w:rFonts w:ascii="Times New Roman" w:hAnsi="Times New Roman" w:cs="Times New Roman" w:eastAsia="Times New Roman"/>
-          <w:b/>
-          <w:i w:val="0"/>
-          <w:sz w:val="28"/>
-          <w:u w:val="none"/>
-        </w:rPr>
-        <w:t>Relevance of the research topic</w:t>
+        <w:t xml:space="preserve"> Diabetic retinopathy is a microvascular complication of diabetes and one of the leading causes of preventable vision loss among adults of working age. Its earliest stages, in which microaneurysms and small haemorrhages appear without affecting acuity, are asymptomatic, so a patient has no reason to seek care during the interval in which intervention is most effective. Detection therefore depends not on presentation but on scheduled imaging of a cohort defined by a systemic diagnosis. Screening is, before it is a diagnostic problem, a problem of volume, and volume is what makes the capacity constraint binding: manual grading scales linearly with specialist time, which is finite and geographically concentrated. That automation is technically feasible has been established for a decade, so the relevance of this work rests not on a claim that automated screening remains undemonstrated, but on the conditions under which the demonstrations were obtained: reported performance has been shown to be unevenly robust, and the images are not a stable substrate — photographs acquired by different cameras, operators and dilation states vary systematically, and where screening capacity is scarcest, acquisition conditions are least controlled. The methodological question follows: it concerns how models of this kind are specified rather than how well any one performs. Preprocessing may be treated as ancillary data preparation not requiring methodological discussion, or as an integral component of the model, because the transform applied before the first convolution determines the feature space the network is obliged to operate in. If the second is right, a model reported without its preprocessing specified has not been fully described, and comparisons between such models are comparisons between partly unknown systems.</w:t>
       </w:r>
     </w:p>
     <w:p>
@@ -100,12 +170,22 @@
       <w:r>
         <w:rPr>
           <w:rFonts w:ascii="Times New Roman" w:hAnsi="Times New Roman" w:cs="Times New Roman" w:eastAsia="Times New Roman"/>
+          <w:b/>
+          <w:i w:val="0"/>
+          <w:sz w:val="28"/>
+          <w:u w:val="none"/>
+        </w:rPr>
+        <w:t>The aim of the research</w:t>
+      </w:r>
+      <w:r>
+        <w:rPr>
+          <w:rFonts w:ascii="Times New Roman" w:hAnsi="Times New Roman" w:cs="Times New Roman" w:eastAsia="Times New Roman"/>
           <w:b w:val="0"/>
           <w:i w:val="0"/>
           <w:sz w:val="28"/>
           <w:u w:val="none"/>
         </w:rPr>
-        <w:t>Diabetic retinopathy (DR) is one of the leading causes of preventable blindness among the working-age population worldwide. Because the early stages of DR are clinically asymptomatic, timely detection depends on regular screening of fundus images, yet the number of ophthalmologists is insufficient to manually examine the rapidly growing population of diabetic patients — a shortage that is especially acute in resource-limited and rural healthcare settings, including the regions of Kazakhstan. Automated diagnosis based on convolutional neural networks (CNNs) is therefore a practically significant direction of research.</w:t>
+        <w:t xml:space="preserve"> is to develop and experimentally validate an integrated fundus image enhancement and CNN classification framework for automated five-class DR diagnosis, in which an 8-stage preprocessing pipeline is specified as an integral component of the model, and to establish, under controlled contrast against an equivalent configuration trained without that pipeline, what difference the specification makes to performance, transferability and interpretability.</w:t>
       </w:r>
     </w:p>
     <w:p>
@@ -116,22 +196,12 @@
       <w:r>
         <w:rPr>
           <w:rFonts w:ascii="Times New Roman" w:hAnsi="Times New Roman" w:cs="Times New Roman" w:eastAsia="Times New Roman"/>
-          <w:b w:val="0"/>
-          <w:i w:val="0"/>
-          <w:sz w:val="28"/>
-          <w:u w:val="none"/>
-        </w:rPr>
-        <w:t xml:space="preserve">The dominant tradition in automated DR diagnosis — here designated paradigm </w:t>
-      </w:r>
-      <w:r>
-        <w:rPr>
-          <w:rFonts w:ascii="Times New Roman" w:hAnsi="Times New Roman" w:cs="Times New Roman" w:eastAsia="Times New Roman"/>
           <w:b/>
           <w:i w:val="0"/>
           <w:sz w:val="28"/>
           <w:u w:val="none"/>
         </w:rPr>
-        <w:t>P1</w:t>
+        <w:t>Research objectives:</w:t>
       </w:r>
       <w:r>
         <w:rPr>
@@ -141,7 +211,7 @@
           <w:sz w:val="28"/>
           <w:u w:val="none"/>
         </w:rPr>
-        <w:t>, the end-to-end CNN paradigm — treats image preprocessing as ancillary data preparation that does not require methodological discussion, on the assumption that a sufficiently deep network learns the relevant invariances directly from raw or minimally normalised pixels. In practice, however, fundus images acquired by different cameras, under different illumination conditions, and with different noise levels exhibit substantial domain variability. This variability manifests as distribution shift in the input feature space and degrades the generalisation of CNN models trained on one domain when they are applied to another. The methodological gap motivating this dissertation is the absence of a formalised, experimentally controlled treatment of preprocessing as an integral component of the diagnostic model.</w:t>
+        <w:t xml:space="preserve"> 1. To analyse the problem domain and formulate the research problem: the clinical grading of the disease, the screening requirements of resource-limited settings, the sources of image-quality loss and the methodological practice of existing automated systems (Chapter 1). 2. To specify the integrated methodology: the 8-stage pipeline, the classification architectures, the pretraining and fine-tuning strategy, the explainability formalism and the evaluation protocol (Chapter 2). 3. To evaluate the integrated configuration experimentally, in domain and on seven external corpora, and to validate the results statistically (Chapter 3). 4. To build and describe a screening system around the model, suited to settings without inference acceleration and with intermittent connectivity (Chapter 4).</w:t>
       </w:r>
     </w:p>
     <w:p>
@@ -152,22 +222,12 @@
       <w:r>
         <w:rPr>
           <w:rFonts w:ascii="Times New Roman" w:hAnsi="Times New Roman" w:cs="Times New Roman" w:eastAsia="Times New Roman"/>
-          <w:b w:val="0"/>
-          <w:i w:val="0"/>
-          <w:sz w:val="28"/>
-          <w:u w:val="none"/>
-        </w:rPr>
-        <w:t xml:space="preserve">This work advances an alternative paradigm — </w:t>
-      </w:r>
-      <w:r>
-        <w:rPr>
-          <w:rFonts w:ascii="Times New Roman" w:hAnsi="Times New Roman" w:cs="Times New Roman" w:eastAsia="Times New Roman"/>
           <w:b/>
           <w:i w:val="0"/>
           <w:sz w:val="28"/>
           <w:u w:val="none"/>
         </w:rPr>
-        <w:t>P2</w:t>
+        <w:t>The object of the research</w:t>
       </w:r>
       <w:r>
         <w:rPr>
@@ -177,24 +237,7 @@
           <w:sz w:val="28"/>
           <w:u w:val="none"/>
         </w:rPr>
-        <w:t>, the integrated preprocessing-CNN paradigm — in which preprocessing is an integral component of the model itself, because it defines the feature space available to the network and therefore co-determines what the network can learn. The relevance of the topic follows from the need to reduce inter-device and inter-acquisition domain variability while preserving diagnostically relevant retinal features, and to do so under the computational constraints characteristic of real screening environments.</w:t>
-      </w:r>
-    </w:p>
-    <w:p>
-      <w:pPr>
-        <w:keepNext/>
-        <w:spacing w:before="240" w:after="120"/>
-        <w:jc w:val="left"/>
-      </w:pPr>
-      <w:r>
-        <w:rPr>
-          <w:rFonts w:ascii="Times New Roman" w:hAnsi="Times New Roman" w:cs="Times New Roman" w:eastAsia="Times New Roman"/>
-          <w:b/>
-          <w:i w:val="0"/>
-          <w:sz w:val="28"/>
-          <w:u w:val="none"/>
-        </w:rPr>
-        <w:t>Aim of the research</w:t>
+        <w:t xml:space="preserve"> is the process of automated multi-stage diagnosis of diabetic retinopathy from colour fundus photographs by means of convolutional networks, studied in its entirety — from the image as it leaves the camera to the grade the model assigns.</w:t>
       </w:r>
     </w:p>
     <w:p>
@@ -205,36 +248,13 @@
       <w:r>
         <w:rPr>
           <w:rFonts w:ascii="Times New Roman" w:hAnsi="Times New Roman" w:cs="Times New Roman" w:eastAsia="Times New Roman"/>
-          <w:b w:val="0"/>
-          <w:i w:val="0"/>
-          <w:sz w:val="28"/>
-          <w:u w:val="none"/>
-        </w:rPr>
-        <w:t>To develop and experimentally validate an integrated fundus image enhancement and CNN-based classification framework for automated multi-stage diabetic retinopathy diagnosis, in which an 8-stage preprocessing pipeline is specified as an integral component of the model rather than as preparation of the data, and to establish, under controlled contrast against an equivalent configuration trained without that pipeline, what difference the specification makes to five-class diagnostic performance, to transferability and to the interpretability of the resulting model under constrained computational conditions.</w:t>
-      </w:r>
-    </w:p>
-    <w:p>
-      <w:pPr>
-        <w:keepNext/>
-        <w:spacing w:before="240" w:after="120"/>
-        <w:jc w:val="left"/>
-      </w:pPr>
-      <w:r>
-        <w:rPr>
-          <w:rFonts w:ascii="Times New Roman" w:hAnsi="Times New Roman" w:cs="Times New Roman" w:eastAsia="Times New Roman"/>
           <w:b/>
           <w:i w:val="0"/>
           <w:sz w:val="28"/>
           <w:u w:val="none"/>
         </w:rPr>
-        <w:t>Objectives of the research</w:t>
+        <w:t>The subject of the research</w:t>
       </w:r>
-    </w:p>
-    <w:p>
-      <w:pPr>
-        <w:ind w:left="709" w:hanging="397"/>
-        <w:jc w:val="both"/>
-      </w:pPr>
       <w:r>
         <w:rPr>
           <w:rFonts w:ascii="Times New Roman" w:hAnsi="Times New Roman" w:cs="Times New Roman" w:eastAsia="Times New Roman"/>
@@ -243,80 +263,7 @@
           <w:sz w:val="28"/>
           <w:u w:val="none"/>
         </w:rPr>
-        <w:t>1.</w:t>
-        <w:tab/>
-        <w:t>To analyse the problem domain and formulate the research problem: the clinical grading of the disease, the screening requirements of resource-limited settings, the sources and measured impact of fundus image quality loss and its device-specific component, and the methodological practice of existing automated screening systems (Chapter 1).</w:t>
-      </w:r>
-    </w:p>
-    <w:p>
-      <w:pPr>
-        <w:ind w:left="709" w:hanging="397"/>
-        <w:jc w:val="both"/>
-      </w:pPr>
-      <w:r>
-        <w:rPr>
-          <w:rFonts w:ascii="Times New Roman" w:hAnsi="Times New Roman" w:cs="Times New Roman" w:eastAsia="Times New Roman"/>
-          <w:b w:val="0"/>
-          <w:i w:val="0"/>
-          <w:sz w:val="28"/>
-          <w:u w:val="none"/>
-        </w:rPr>
-        <w:t>2.</w:t>
-        <w:tab/>
-        <w:t>To specify the integrated preprocessing-CNN methodology: the 8-stage pipeline stage by stage with the theoretical foundations of each (histogram equalisation and the dual-constraint CLAHE clip limit, spatial filtering, illumination correction), the classification architectures (ResNet-50, EfficientNet-B3) and their adaptation to five-class grading, the pretraining and fine-tuning strategy, the explainability formalism (Grad-CAM, ALO, IoU), and the evaluation and statistical protocol (Chapter 2).</w:t>
-      </w:r>
-    </w:p>
-    <w:p>
-      <w:pPr>
-        <w:ind w:left="709" w:hanging="397"/>
-        <w:jc w:val="both"/>
-      </w:pPr>
-      <w:r>
-        <w:rPr>
-          <w:rFonts w:ascii="Times New Roman" w:hAnsi="Times New Roman" w:cs="Times New Roman" w:eastAsia="Times New Roman"/>
-          <w:b w:val="0"/>
-          <w:i w:val="0"/>
-          <w:sz w:val="28"/>
-          <w:u w:val="none"/>
-        </w:rPr>
-        <w:t>3.</w:t>
-        <w:tab/>
-        <w:t>To evaluate the framework experimentally through eight investigations conducted on a common substrate — integrated-pipeline dominance under a 2×2 factorial design (Experiment 1); cumulative component ablation with the CLAHE and flat-field parameter sweeps (Experiment 2); direct measurement of source-to-target distance in feature space across six external corpora; cross-dataset transferability (Experiment 3); Grad-CAM explainability against expert lesion annotation (Experiment 4); external clinical performance (Experiment 5); device domain shift (Experiment 6); and training in a data-scarce regime (Experiment 7) — together with the statistical validation, the comparative placement of the results, and the limitations and boundary conditions of the approach (Chapter 3).</w:t>
-      </w:r>
-    </w:p>
-    <w:p>
-      <w:pPr>
-        <w:ind w:left="709" w:hanging="397"/>
-        <w:jc w:val="both"/>
-      </w:pPr>
-      <w:r>
-        <w:rPr>
-          <w:rFonts w:ascii="Times New Roman" w:hAnsi="Times New Roman" w:cs="Times New Roman" w:eastAsia="Times New Roman"/>
-          <w:b w:val="0"/>
-          <w:i w:val="0"/>
-          <w:sz w:val="28"/>
-          <w:u w:val="none"/>
-        </w:rPr>
-        <w:t>4.</w:t>
-        <w:tab/>
-        <w:t>To build and describe a screening system around the model, suited to settings without inference acceleration and with intermittent connectivity, with telemedicine and eHealth integration applicable to Kazakhstan healthcare infrastructure, and to state what of it exists and what remains specification (Chapter 4).</w:t>
-      </w:r>
-    </w:p>
-    <w:p>
-      <w:pPr>
-        <w:keepNext/>
-        <w:spacing w:before="240" w:after="120"/>
-        <w:jc w:val="left"/>
-      </w:pPr>
-      <w:r>
-        <w:rPr>
-          <w:rFonts w:ascii="Times New Roman" w:hAnsi="Times New Roman" w:cs="Times New Roman" w:eastAsia="Times New Roman"/>
-          <w:b/>
-          <w:i w:val="0"/>
-          <w:sz w:val="28"/>
-          <w:u w:val="none"/>
-        </w:rPr>
-        <w:t>Object of the research</w:t>
+        <w:t xml:space="preserve"> is the set of methods by which fundus image preprocessing is integrated with CNN classification, together with the properties the resulting configuration exhibits: its five-class diagnostic performance, its transferability to corpora not seen in training, the alignment of its attention with expert annotation, and its behaviour across camera domains.</w:t>
       </w:r>
     </w:p>
     <w:p>
@@ -327,29 +274,22 @@
       <w:r>
         <w:rPr>
           <w:rFonts w:ascii="Times New Roman" w:hAnsi="Times New Roman" w:cs="Times New Roman" w:eastAsia="Times New Roman"/>
+          <w:b/>
+          <w:i w:val="0"/>
+          <w:sz w:val="28"/>
+          <w:u w:val="none"/>
+        </w:rPr>
+        <w:t>Research methods.</w:t>
+      </w:r>
+      <w:r>
+        <w:rPr>
+          <w:rFonts w:ascii="Times New Roman" w:hAnsi="Times New Roman" w:cs="Times New Roman" w:eastAsia="Times New Roman"/>
           <w:b w:val="0"/>
           <w:i w:val="0"/>
           <w:sz w:val="28"/>
           <w:u w:val="none"/>
         </w:rPr>
-        <w:t>The process of automated multi-stage diagnosis of diabetic retinopathy from colour fundus photographs by means of convolutional neural networks. The process is studied in its entirety, from the image as it leaves the camera to the five-class grade the model assigns, rather than in the classification step alone.</w:t>
-      </w:r>
-    </w:p>
-    <w:p>
-      <w:pPr>
-        <w:keepNext/>
-        <w:spacing w:before="240" w:after="120"/>
-        <w:jc w:val="left"/>
-      </w:pPr>
-      <w:r>
-        <w:rPr>
-          <w:rFonts w:ascii="Times New Roman" w:hAnsi="Times New Roman" w:cs="Times New Roman" w:eastAsia="Times New Roman"/>
-          <w:b/>
-          <w:i w:val="0"/>
-          <w:sz w:val="28"/>
-          <w:u w:val="none"/>
-        </w:rPr>
-        <w:t>Subject of the research</w:t>
+        <w:t xml:space="preserve"> The methodological framework is controlled experimental comparison, in which configurations are contrasted with everything outside the manipulated factor held fixed. Its instruments are drawn from image processing, deep learning and statistical inference: optic-disc and fovea localisation by a pre-trained, frozen heatmap-regression detector; isotropic rescaling with centred padding made explicit to the network as a mask channel; adaptive illumination correction and dual-constraint CLAHE in the LAB colour space; classification with the ResNet-50 and EfficientNet-B3 architectures under a weighted focal loss; Grad-CAM explainability with the Attention–Lesion Overlap and IoU measures; maximum mean discrepancy over penultimate-layer features; and patient-level stratified 5-fold cross-validation with paired testing, bootstrap intervals and correction for multiplicity.</w:t>
       </w:r>
     </w:p>
     <w:p>
@@ -360,29 +300,22 @@
       <w:r>
         <w:rPr>
           <w:rFonts w:ascii="Times New Roman" w:hAnsi="Times New Roman" w:cs="Times New Roman" w:eastAsia="Times New Roman"/>
+          <w:b/>
+          <w:i w:val="0"/>
+          <w:sz w:val="28"/>
+          <w:u w:val="none"/>
+        </w:rPr>
+        <w:t>The empirical basis of the research</w:t>
+      </w:r>
+      <w:r>
+        <w:rPr>
+          <w:rFonts w:ascii="Times New Roman" w:hAnsi="Times New Roman" w:cs="Times New Roman" w:eastAsia="Times New Roman"/>
           <w:b w:val="0"/>
           <w:i w:val="0"/>
           <w:sz w:val="28"/>
           <w:u w:val="none"/>
         </w:rPr>
-        <w:t>Methods and models for integrating fundus image preprocessing (enhancement) with CNN classification, and the properties the resulting integrated configuration exhibits: diagnostic performance under five-class grading, transferability to corpora not seen during training, alignment between its attention and expert-annotated pathology, and behaviour across camera domains. It is the integration that is manipulated, not the preprocessing considered apart from the network it feeds.</w:t>
-      </w:r>
-    </w:p>
-    <w:p>
-      <w:pPr>
-        <w:keepNext/>
-        <w:spacing w:before="240" w:after="120"/>
-        <w:jc w:val="left"/>
-      </w:pPr>
-      <w:r>
-        <w:rPr>
-          <w:rFonts w:ascii="Times New Roman" w:hAnsi="Times New Roman" w:cs="Times New Roman" w:eastAsia="Times New Roman"/>
-          <w:b/>
-          <w:i w:val="0"/>
-          <w:sz w:val="28"/>
-          <w:u w:val="none"/>
-        </w:rPr>
-        <w:t>Methodology and methods of the research</w:t>
+        <w:t xml:space="preserve"> is a tiered corpus of eight public and clinical fundus datasets from cameras of four manufacturers (Canon, Topcon, Kowa, Zeiss): EyePACS (~35,126 graded images, training and ablation), whose unlabelled split (~53,576 images) supplies the in-domain pretraining corpus and is disjoint from the training set; APTOS 2019 (~3,662, cross-dataset transfer); IDRiD (516 images, 81 with pixel-level lesion masks) and Messidor-2 (~1,748) for external clinical evaluation; DDR (~13,673), ODIR-5K (~5,000) and RFMiD (~3,200) for device-shift evaluation; and a Kazakh clinical dataset (60 images, 30 patients × 2 eyes) for training in a data-scarce regime. Results are reported per corpus and never aggregated into a single figure of merit.</w:t>
       </w:r>
     </w:p>
     <w:p>
@@ -393,29 +326,22 @@
       <w:r>
         <w:rPr>
           <w:rFonts w:ascii="Times New Roman" w:hAnsi="Times New Roman" w:cs="Times New Roman" w:eastAsia="Times New Roman"/>
+          <w:b/>
+          <w:i w:val="0"/>
+          <w:sz w:val="28"/>
+          <w:u w:val="none"/>
+        </w:rPr>
+        <w:t>The scientific novelty</w:t>
+      </w:r>
+      <w:r>
+        <w:rPr>
+          <w:rFonts w:ascii="Times New Roman" w:hAnsi="Times New Roman" w:cs="Times New Roman" w:eastAsia="Times New Roman"/>
           <w:b w:val="0"/>
           <w:i w:val="0"/>
           <w:sz w:val="28"/>
           <w:u w:val="none"/>
         </w:rPr>
-        <w:t>The research methodology combines image-processing theory, deep-learning theory, and an experimentally controlled validation framework. The methods used include: optic-disc and fovea localisation for rotation normalisation by a pre-trained, frozen heatmap-regression detector, not co-trained with the classifier, so that the preprocessing remains a fixed transform; adaptive flat-field illumination correction applied inside the FOV mask only, dual-constraint Contrast-Limited Adaptive Histogram Equalisation (CLAHE) in the LAB colour space, CNN classification with ResNet-50 and EfficientNet-B3 backbones, transfer learning from ImageNet for the baseline arm and in-domain pretraining for the integrated arm — the choice among candidate initialisations being settled by a frozen-backbone linear-probe acceptance gate rather than assumed — Focal Loss for class imbalance, Grad-CAM explainability analysis with Attention–Lesion Overlap (primary) and IoU (secondary), maximum mean discrepancy over penultimate-layer features for the direct measurement of domain shift (with per-channel histogram divergence as informational context), and a statistical validation framework based on 5-fold patient-level stratified cross-validation, McNemar and DeLong tests, mixed-effects modelling, bootstrap confidence intervals, and Bonferroni/Holm correction for multiple comparisons.</w:t>
-      </w:r>
-    </w:p>
-    <w:p>
-      <w:pPr>
-        <w:keepNext/>
-        <w:spacing w:before="240" w:after="120"/>
-        <w:jc w:val="left"/>
-      </w:pPr>
-      <w:r>
-        <w:rPr>
-          <w:rFonts w:ascii="Times New Roman" w:hAnsi="Times New Roman" w:cs="Times New Roman" w:eastAsia="Times New Roman"/>
-          <w:b/>
-          <w:i w:val="0"/>
-          <w:sz w:val="28"/>
-          <w:u w:val="none"/>
-        </w:rPr>
-        <w:t>Empirical (experimental) basis</w:t>
+        <w:t xml:space="preserve"> of the research consists in the following: 1. The principal contribution is conceptual: preprocessing is reframed from ancillary preparation to an integral component of the diagnostic model — formalised as a binding part of the model specification and placed under controlled experimental contrast, so that what is new is not the existence of a pipeline but the treatment of one as an object of experiment. 2. Five elements of its engineering realisation are specified in forms not previously combined: isotropic resize with centred padding; a field-of-view mask supplied as a fourth input channel; illumination correction scaled to per-image geometry and applied inside the mask only; channel statistics computed from valid fundus pixels; and canonical orientation whose augmentation dispersion derives from the uncertainty of the landmark localisation. 3. The clip limit of the contrast stage is the minimum of a histogram-relative and a tile-relative constraint, applied stochastically at training time so the stage serves as both enhancement and regularisation; the formulation extends the candidate's previously published work. 4. Attention alignment is measured by the fraction of an annotated lesion that model attention covers, on the reasoning that lesion coverage is the clinically meaningful direction. 5. The postulated mechanism is measured rather than inferred: source-to-target distance is computed at the penultimate layer under both configurations across six external corpora, whereas work of this kind ordinarily judges the mechanism by external accuracy. 6. A defect shared by a family of measures in common use for external robustness is identified analytically: each normalises an arm's external performance against that same arm's in-domain performance and so penalises a configuration for its in-domain strength.</w:t>
       </w:r>
     </w:p>
     <w:p>
@@ -426,36 +352,13 @@
       <w:r>
         <w:rPr>
           <w:rFonts w:ascii="Times New Roman" w:hAnsi="Times New Roman" w:cs="Times New Roman" w:eastAsia="Times New Roman"/>
-          <w:b w:val="0"/>
-          <w:i w:val="0"/>
-          <w:sz w:val="28"/>
-          <w:u w:val="none"/>
-        </w:rPr>
-        <w:t>Eight datasets organised into functional tiers: EyePACS (~35,126 graded images, primary training and ablation, Canon CR-1), whose second, unlabelled split (~53,576 images) supplies the in-domain pretraining corpus of the integrated arm, disjoint from it by image and patient identity; APTOS 2019 (~3,662, cross-dataset transfer); IDRiD (516 images, 81 with pixel-level lesion masks, clinical validation and explainability, Kowa); Messidor-2 (~1,748, external clinical evaluation, Topcon); DDR (~13,673, device shift, Canon/Topcon); ODIR-5K (~5,000, device shift, Canon/Zeiss); RFMiD (~3,200, device shift, Topcon/Kowa); and a Kazakh clinical dataset (60 images, 30 patients × 2 eyes, balanced by grade, training in a data-scarce regime), which cannot be redistributed, so that results depending on it are not externally reproducible. The device-domain corpora annotated under multi-disease taxonomies are used as sources of DR labels only. Image quality is evaluated with contrast-to-noise ratio (CNR), image entropy, and SSIM; results are reported per corpus and never aggregated into a single figure of merit.</w:t>
-      </w:r>
-    </w:p>
-    <w:p>
-      <w:pPr>
-        <w:keepNext/>
-        <w:spacing w:before="240" w:after="120"/>
-        <w:jc w:val="left"/>
-      </w:pPr>
-      <w:r>
-        <w:rPr>
-          <w:rFonts w:ascii="Times New Roman" w:hAnsi="Times New Roman" w:cs="Times New Roman" w:eastAsia="Times New Roman"/>
           <w:b/>
           <w:i w:val="0"/>
           <w:sz w:val="28"/>
           <w:u w:val="none"/>
         </w:rPr>
-        <w:t>Scientific novelty</w:t>
+        <w:t>The main results of the research.</w:t>
       </w:r>
-    </w:p>
-    <w:p>
-      <w:pPr>
-        <w:ind w:left="709" w:hanging="397"/>
-        <w:jc w:val="both"/>
-      </w:pPr>
       <w:r>
         <w:rPr>
           <w:rFonts w:ascii="Times New Roman" w:hAnsi="Times New Roman" w:cs="Times New Roman" w:eastAsia="Times New Roman"/>
@@ -464,403 +367,7 @@
           <w:sz w:val="28"/>
           <w:u w:val="none"/>
         </w:rPr>
-        <w:t>1.</w:t>
-        <w:tab/>
-        <w:t>An 8-stage integrated fundus preprocessing pipeline is formalised as a binding component of the diagnostic model (operationalisation of paradigm P2), comprising canonical flip, OD-fovea rotation normalisation, FOV crop with isotropic resize and centred zero-padding, FOV mask generation as a 4th input channel, adaptive flat-field correction (σ = 0.07 × FOV diameter), dual-constraint stochastic CLAHE on the LAB L-channel, augmentation, and dataset-specific channel-wise normalisation.</w:t>
-      </w:r>
-    </w:p>
-    <w:p>
-      <w:pPr>
-        <w:ind w:left="709" w:hanging="397"/>
-        <w:jc w:val="both"/>
-      </w:pPr>
-      <w:r>
-        <w:rPr>
-          <w:rFonts w:ascii="Times New Roman" w:hAnsi="Times New Roman" w:cs="Times New Roman" w:eastAsia="Times New Roman"/>
-          <w:b w:val="0"/>
-          <w:i w:val="0"/>
-          <w:sz w:val="28"/>
-          <w:u w:val="none"/>
-        </w:rPr>
-        <w:t>2.</w:t>
-        <w:tab/>
-        <w:t>The hypothesis of integrated-pipeline dominance is formalised and tested under a controlled 2×2 factorial design (configurations A–D) over two established architectures (ResNet-50, EfficientNet-B3), with a pre-registered dominance criterion (Δ weighted F1 ≥ 5 pp, Δ ROC-AUC ≥ 0.02, no Cohen's Kappa degradation).</w:t>
-      </w:r>
-    </w:p>
-    <w:p>
-      <w:pPr>
-        <w:ind w:left="709" w:hanging="397"/>
-        <w:jc w:val="both"/>
-      </w:pPr>
-      <w:r>
-        <w:rPr>
-          <w:rFonts w:ascii="Times New Roman" w:hAnsi="Times New Roman" w:cs="Times New Roman" w:eastAsia="Times New Roman"/>
-          <w:b w:val="0"/>
-          <w:i w:val="0"/>
-          <w:sz w:val="28"/>
-          <w:u w:val="none"/>
-        </w:rPr>
-        <w:t>3.</w:t>
-        <w:tab/>
-        <w:t>A cumulative ablation under a single initialisation separates the preprocessing contribution from the initialisation with which the factorial design necessarily confounds it; the decomposition does not convert that design into a single-factor manipulation, and no claim about the isolated effect of preprocessing rests on it.</w:t>
-      </w:r>
-    </w:p>
-    <w:p>
-      <w:pPr>
-        <w:ind w:left="709" w:hanging="397"/>
-        <w:jc w:val="both"/>
-      </w:pPr>
-      <w:r>
-        <w:rPr>
-          <w:rFonts w:ascii="Times New Roman" w:hAnsi="Times New Roman" w:cs="Times New Roman" w:eastAsia="Times New Roman"/>
-          <w:b w:val="0"/>
-          <w:i w:val="0"/>
-          <w:sz w:val="28"/>
-          <w:u w:val="none"/>
-        </w:rPr>
-        <w:t>4.</w:t>
-        <w:tab/>
-        <w:t>A dual-constraint stochastic CLAHE variant is formalised and validated within the five-class DR context (LAB L-channel; clip limit CL = min(clip_factor × tile_area / 256, global_threshold × tile_area); 80% train-time probability), the stage serving at once as an enhancement operator and as a source of regularisation. The formulation extends the candidate's previously published work on fundus image enhancement rather than originating here; new are its formalisation, its embedding in a specified pipeline, and its validation in the five-class grading task.</w:t>
-      </w:r>
-    </w:p>
-    <w:p>
-      <w:pPr>
-        <w:ind w:left="709" w:hanging="397"/>
-        <w:jc w:val="both"/>
-      </w:pPr>
-      <w:r>
-        <w:rPr>
-          <w:rFonts w:ascii="Times New Roman" w:hAnsi="Times New Roman" w:cs="Times New Roman" w:eastAsia="Times New Roman"/>
-          <w:b w:val="0"/>
-          <w:i w:val="0"/>
-          <w:sz w:val="28"/>
-          <w:u w:val="none"/>
-        </w:rPr>
-        <w:t>5.</w:t>
-        <w:tab/>
-        <w:t>An adaptive flat-field illumination correction is introduced whose Gaussian σ scales with the per-image FOV diameter rather than using a fixed global value, applied only inside the FOV mask so that the padding is not corrupted.</w:t>
-      </w:r>
-    </w:p>
-    <w:p>
-      <w:pPr>
-        <w:ind w:left="709" w:hanging="397"/>
-        <w:jc w:val="both"/>
-      </w:pPr>
-      <w:r>
-        <w:rPr>
-          <w:rFonts w:ascii="Times New Roman" w:hAnsi="Times New Roman" w:cs="Times New Roman" w:eastAsia="Times New Roman"/>
-          <w:b w:val="0"/>
-          <w:i w:val="0"/>
-          <w:sz w:val="28"/>
-          <w:u w:val="none"/>
-        </w:rPr>
-        <w:t>6.</w:t>
-        <w:tab/>
-        <w:t>An explicit binary FOV mask is introduced as a dedicated pipeline stage and appended as the 4th input channel, informing the CNN of valid pixel regions and preventing padding artefacts from being learned as features.</w:t>
-      </w:r>
-    </w:p>
-    <w:p>
-      <w:pPr>
-        <w:ind w:left="709" w:hanging="397"/>
-        <w:jc w:val="both"/>
-      </w:pPr>
-      <w:r>
-        <w:rPr>
-          <w:rFonts w:ascii="Times New Roman" w:hAnsi="Times New Roman" w:cs="Times New Roman" w:eastAsia="Times New Roman"/>
-          <w:b w:val="0"/>
-          <w:i w:val="0"/>
-          <w:sz w:val="28"/>
-          <w:u w:val="none"/>
-        </w:rPr>
-        <w:t>7.</w:t>
-        <w:tab/>
-        <w:t>Attention–Lesion Overlap (ALO) is introduced as a primary, asymmetric explainability metric that directly measures the fraction of a lesion covered by model attention, complemented by Intersection-over-Union (IoU) as a secondary metric, evaluated against IDRiD pixel-level lesion masks. It establishes alignment between model evidence and expert annotation, not clinical localisation of pathology.</w:t>
-      </w:r>
-    </w:p>
-    <w:p>
-      <w:pPr>
-        <w:ind w:left="709" w:hanging="397"/>
-        <w:jc w:val="both"/>
-      </w:pPr>
-      <w:r>
-        <w:rPr>
-          <w:rFonts w:ascii="Times New Roman" w:hAnsi="Times New Roman" w:cs="Times New Roman" w:eastAsia="Times New Roman"/>
-          <w:b w:val="0"/>
-          <w:i w:val="0"/>
-          <w:sz w:val="28"/>
-          <w:u w:val="none"/>
-        </w:rPr>
-        <w:t>8.</w:t>
-        <w:tab/>
-        <w:t>The mechanism postulated by the central hypothesis is measured directly rather than inferred from its consequence: source-to-target distance is computed at the penultimate layer under both configurations across six external corpora, at the cost of forward passes only. Two design features carry the contribution — normalisation uses source-domain statistics and is never recomputed on the target, so the measurement is a property of the preprocessing and not of a procedure fitted to the target; and its falsifiability was recorded before it was made, since two stages of the pipeline are bound to the source domain by construction and a reversal was therefore a live possibility.</w:t>
-      </w:r>
-    </w:p>
-    <w:p>
-      <w:pPr>
-        <w:ind w:left="709" w:hanging="397"/>
-        <w:jc w:val="both"/>
-      </w:pPr>
-      <w:r>
-        <w:rPr>
-          <w:rFonts w:ascii="Times New Roman" w:hAnsi="Times New Roman" w:cs="Times New Roman" w:eastAsia="Times New Roman"/>
-          <w:b w:val="0"/>
-          <w:i w:val="0"/>
-          <w:sz w:val="28"/>
-          <w:u w:val="none"/>
-        </w:rPr>
-        <w:t>9.</w:t>
-        <w:tab/>
-        <w:t>The integrated arm is initialised from in-domain rather than natural-image pretraining, with the choice among candidate initialisations settled by a frozen-backbone linear-probe acceptance gate rather than by assumption. The negative outcome is reported as evidence: label-free self-supervision trained from scratch on the in-domain corpus failed that gate, across several protocols of the same family and without improvement from longer training, and was not admitted.</w:t>
-      </w:r>
-    </w:p>
-    <w:p>
-      <w:pPr>
-        <w:ind w:left="709" w:hanging="397"/>
-        <w:jc w:val="both"/>
-      </w:pPr>
-      <w:r>
-        <w:rPr>
-          <w:rFonts w:ascii="Times New Roman" w:hAnsi="Times New Roman" w:cs="Times New Roman" w:eastAsia="Times New Roman"/>
-          <w:b w:val="0"/>
-          <w:i w:val="0"/>
-          <w:sz w:val="28"/>
-          <w:u w:val="none"/>
-        </w:rPr>
-        <w:t>10.</w:t>
-        <w:tab/>
-        <w:t>The integrated pipeline is validated across a tiered multi-dataset, multi-device architecture (EyePACS, APTOS 2019, IDRiD, Messidor-2, DDR, ODIR-5K, RFMiD, and a Kazakh clinical dataset), organised by function and spanning four camera manufacturers (Canon, Topcon, Kowa, Zeiss), including cross-dataset transfer, external clinical performance, and device domain shift.</w:t>
-      </w:r>
-    </w:p>
-    <w:p>
-      <w:pPr>
-        <w:ind w:left="709" w:hanging="397"/>
-        <w:jc w:val="both"/>
-      </w:pPr>
-      <w:r>
-        <w:rPr>
-          <w:rFonts w:ascii="Times New Roman" w:hAnsi="Times New Roman" w:cs="Times New Roman" w:eastAsia="Times New Roman"/>
-          <w:b w:val="0"/>
-          <w:i w:val="0"/>
-          <w:sz w:val="28"/>
-          <w:u w:val="none"/>
-        </w:rPr>
-        <w:t>11.</w:t>
-        <w:tab/>
-        <w:t>A defect shared by three measures in common use for expressing external robustness is identified analytically: the degradation quantity, the generalisation ratio and the retention ratio each normalise or difference an arm's external performance against that same arm's in-domain performance, and therefore penalise a configuration for its in-domain strength. The analysis is strictly descriptive and rehabilitates no result of this work.</w:t>
-      </w:r>
-    </w:p>
-    <w:p>
-      <w:pPr>
-        <w:ind w:left="709" w:hanging="397"/>
-        <w:jc w:val="both"/>
-      </w:pPr>
-      <w:r>
-        <w:rPr>
-          <w:rFonts w:ascii="Times New Roman" w:hAnsi="Times New Roman" w:cs="Times New Roman" w:eastAsia="Times New Roman"/>
-          <w:b w:val="0"/>
-          <w:i w:val="0"/>
-          <w:sz w:val="28"/>
-          <w:u w:val="none"/>
-        </w:rPr>
-        <w:t>12.</w:t>
-        <w:tab/>
-        <w:t>Two contributions are non-empirical by design: the coupled thermal-optical model of fundus tissue response under laser exposure, a theoretical and computational contribution only; and the modular screening-system architecture, a design contribution realised in part as a working demonstrator, which establishes realisability and operating behaviour and is evidence for no diagnostic claim — no clinical deployment testing conducted.</w:t>
-      </w:r>
-    </w:p>
-    <w:p>
-      <w:pPr>
-        <w:keepNext/>
-        <w:spacing w:before="240" w:after="120"/>
-        <w:jc w:val="left"/>
-      </w:pPr>
-      <w:r>
-        <w:rPr>
-          <w:rFonts w:ascii="Times New Roman" w:hAnsi="Times New Roman" w:cs="Times New Roman" w:eastAsia="Times New Roman"/>
-          <w:b/>
-          <w:i w:val="0"/>
-          <w:sz w:val="28"/>
-          <w:u w:val="none"/>
-        </w:rPr>
-        <w:t>Main results of the research</w:t>
-      </w:r>
-    </w:p>
-    <w:p>
-      <w:pPr>
-        <w:ind w:left="709" w:hanging="397"/>
-        <w:jc w:val="both"/>
-      </w:pPr>
-      <w:r>
-        <w:rPr>
-          <w:rFonts w:ascii="Times New Roman" w:hAnsi="Times New Roman" w:cs="Times New Roman" w:eastAsia="Times New Roman"/>
-          <w:b w:val="0"/>
-          <w:i w:val="0"/>
-          <w:sz w:val="28"/>
-          <w:u w:val="none"/>
-        </w:rPr>
-        <w:t>1.</w:t>
-        <w:tab/>
-        <w:t>A critical analysis of the medical, epidemiological, and technical context of automated DR diagnosis and of fundus image quality variability was carried out; the limitations of the end-to-end paradigm (P1) were identified and the research problem was formulated.</w:t>
-      </w:r>
-    </w:p>
-    <w:p>
-      <w:pPr>
-        <w:ind w:left="709" w:hanging="397"/>
-        <w:jc w:val="both"/>
-      </w:pPr>
-      <w:r>
-        <w:rPr>
-          <w:rFonts w:ascii="Times New Roman" w:hAnsi="Times New Roman" w:cs="Times New Roman" w:eastAsia="Times New Roman"/>
-          <w:b w:val="0"/>
-          <w:i w:val="0"/>
-          <w:sz w:val="28"/>
-          <w:u w:val="none"/>
-        </w:rPr>
-        <w:t>2.</w:t>
-        <w:tab/>
-        <w:t>An 8-stage integrated preprocessing pipeline was designed and formalised as an integral component of the diagnostic model (paradigm P2), comprising canonical flip, OD-fovea rotation normalisation, FOV crop with isotropic resize and centred zero-padding, FOV mask generation as a 4th input channel, adaptive flat-field correction, dual-constraint stochastic CLAHE, augmentation, and dataset-specific normalisation.</w:t>
-      </w:r>
-    </w:p>
-    <w:p>
-      <w:pPr>
-        <w:ind w:left="709" w:hanging="397"/>
-        <w:jc w:val="both"/>
-      </w:pPr>
-      <w:r>
-        <w:rPr>
-          <w:rFonts w:ascii="Times New Roman" w:hAnsi="Times New Roman" w:cs="Times New Roman" w:eastAsia="Times New Roman"/>
-          <w:b w:val="0"/>
-          <w:i w:val="0"/>
-          <w:sz w:val="28"/>
-          <w:u w:val="none"/>
-        </w:rPr>
-        <w:t>3.</w:t>
-        <w:tab/>
-        <w:t>The dominance of the integrated configuration over the baseline was established under a controlled 2×2 factorial design (configurations A–D) on EyePACS for both ResNet-50 and EfficientNet-B3: the pre-registered criterion was satisfied in all three of its components, the effect survived correction for multiple comparisons, and showed no interaction with the choice of architecture (Experiment 1). It is a property of the configuration, which differs from the baseline in initialisation as well as in preprocessing.</w:t>
-      </w:r>
-    </w:p>
-    <w:p>
-      <w:pPr>
-        <w:ind w:left="709" w:hanging="397"/>
-        <w:jc w:val="both"/>
-      </w:pPr>
-      <w:r>
-        <w:rPr>
-          <w:rFonts w:ascii="Times New Roman" w:hAnsi="Times New Roman" w:cs="Times New Roman" w:eastAsia="Times New Roman"/>
-          <w:b w:val="0"/>
-          <w:i w:val="0"/>
-          <w:sz w:val="28"/>
-          <w:u w:val="none"/>
-        </w:rPr>
-        <w:t>4.</w:t>
-        <w:tab/>
-        <w:t>The contribution of the individual pipeline stages was quantified through a cumulative component ablation under a single initialisation: every stage transition contributed more than the between-fold dispersion of its level, the contributions separate into groups with the two photometric stages leading, and the ablation recovered the whole in-domain gain. The CLAHE clip limit and the flat-field σ each exhibited an interior optimum within the ranges swept, confirmed on held-out data and supported by image-quality metrics (CNR, entropy, SSIM) (Experiment 2).</w:t>
-      </w:r>
-    </w:p>
-    <w:p>
-      <w:pPr>
-        <w:ind w:left="709" w:hanging="397"/>
-        <w:jc w:val="both"/>
-      </w:pPr>
-      <w:r>
-        <w:rPr>
-          <w:rFonts w:ascii="Times New Roman" w:hAnsi="Times New Roman" w:cs="Times New Roman" w:eastAsia="Times New Roman"/>
-          <w:b w:val="0"/>
-          <w:i w:val="0"/>
-          <w:sz w:val="28"/>
-          <w:u w:val="none"/>
-        </w:rPr>
-        <w:t>5.</w:t>
-        <w:tab/>
-        <w:t>The reduction of source-to-target distance in feature space was measured directly across six external corpora under a mandatory source-domain-statistics condition: the distance fell on every corpus examined, supplying the middle term of the causal chain that the remaining investigations approach only through its consequence — in direction only, since the magnitude of a distance reduction does not track the magnitude of any performance gain.</w:t>
-      </w:r>
-    </w:p>
-    <w:p>
-      <w:pPr>
-        <w:ind w:left="709" w:hanging="397"/>
-        <w:jc w:val="both"/>
-      </w:pPr>
-      <w:r>
-        <w:rPr>
-          <w:rFonts w:ascii="Times New Roman" w:hAnsi="Times New Roman" w:cs="Times New Roman" w:eastAsia="Times New Roman"/>
-          <w:b w:val="0"/>
-          <w:i w:val="0"/>
-          <w:sz w:val="28"/>
-          <w:u w:val="none"/>
-        </w:rPr>
-        <w:t>6.</w:t>
-        <w:tab/>
-        <w:t>A model trained on EyePACS with the pipeline transferred to APTOS 2019 without retraining, clearing the pre-registered generalisation ratio G ≥ 0.85 and exceeding the baseline on every grade; the baseline also cleared the threshold, so the evidence lies in the comparison rather than in the criterion (Experiment 3).</w:t>
-      </w:r>
-    </w:p>
-    <w:p>
-      <w:pPr>
-        <w:ind w:left="709" w:hanging="397"/>
-        <w:jc w:val="both"/>
-      </w:pPr>
-      <w:r>
-        <w:rPr>
-          <w:rFonts w:ascii="Times New Roman" w:hAnsi="Times New Roman" w:cs="Times New Roman" w:eastAsia="Times New Roman"/>
-          <w:b w:val="0"/>
-          <w:i w:val="0"/>
-          <w:sz w:val="28"/>
-          <w:u w:val="none"/>
-        </w:rPr>
-        <w:t>7.</w:t>
-        <w:tab/>
-        <w:t>Grad-CAM explainability analysis, using the proposed Attention–Lesion Overlap (ALO, primary) and IoU (secondary) against IDRiD pixel-level lesion masks, found model attention more closely aligned with expert annotation under the integrated configuration, on all four annotated lesion types and both measures (Experiment 4); the qualitative examination on the clinical corpus was not carried out.</w:t>
-      </w:r>
-    </w:p>
-    <w:p>
-      <w:pPr>
-        <w:ind w:left="709" w:hanging="397"/>
-        <w:jc w:val="both"/>
-      </w:pPr>
-      <w:r>
-        <w:rPr>
-          <w:rFonts w:ascii="Times New Roman" w:hAnsi="Times New Roman" w:cs="Times New Roman" w:eastAsia="Times New Roman"/>
-          <w:b w:val="0"/>
-          <w:i w:val="0"/>
-          <w:sz w:val="28"/>
-          <w:u w:val="none"/>
-        </w:rPr>
-        <w:t>8.</w:t>
-        <w:tab/>
-        <w:t>On both external clinical corpora the integrated configuration attained higher absolute weighted F1, each difference reaching the minimal clinically important difference with its interval excluding zero (Experiment 5 — higher absolute external performance, not resistance to degradation); performance was maintained across all five camera groupings with their dispersion reduced (Experiment 6); and in the data-scarce regime the integrated configuration was again the stronger, by a margin comparable to, and not larger than, the one measured with abundant data (Experiment 7).</w:t>
-      </w:r>
-    </w:p>
-    <w:p>
-      <w:pPr>
-        <w:ind w:left="709" w:hanging="397"/>
-        <w:jc w:val="both"/>
-      </w:pPr>
-      <w:r>
-        <w:rPr>
-          <w:rFonts w:ascii="Times New Roman" w:hAnsi="Times New Roman" w:cs="Times New Roman" w:eastAsia="Times New Roman"/>
-          <w:b w:val="0"/>
-          <w:i w:val="0"/>
-          <w:sz w:val="28"/>
-          <w:u w:val="none"/>
-        </w:rPr>
-        <w:t>9.</w:t>
-        <w:tab/>
-        <w:t>A modular architecture for an automated DR screening system suitable for resource-limited environments, with telemedicine and eHealth integration applicable to Kazakhstan healthcare infrastructure, was designed, and a working demonstrator of it was built and deployed: it runs the preprocessing pipeline and the trained classifier end to end, produces attention maps, and keeps a per-case record including the reviewing ophthalmologist's verdict. The demonstrator establishes that the design is realisable and what it does in operation; the deployment-oriented parts it does not realise remain specification, and no clinical deployment testing was conducted.</w:t>
-      </w:r>
-    </w:p>
-    <w:p>
-      <w:pPr>
-        <w:keepNext/>
-        <w:spacing w:before="240" w:after="120"/>
-        <w:jc w:val="left"/>
-      </w:pPr>
-      <w:r>
-        <w:rPr>
-          <w:rFonts w:ascii="Times New Roman" w:hAnsi="Times New Roman" w:cs="Times New Roman" w:eastAsia="Times New Roman"/>
-          <w:b/>
-          <w:i w:val="0"/>
-          <w:sz w:val="28"/>
-          <w:u w:val="none"/>
-        </w:rPr>
-        <w:t>Statements submitted for defense</w:t>
+        <w:t xml:space="preserve"> 1. A critical analysis of the context of automated DR diagnosis and of fundus image quality variability was carried out, the limitations of the end-to-end paradigm were identified and the research problem was formulated. 2. An 8-stage preprocessing pipeline was designed and formalised: canonical flip, OD-fovea rotation normalisation, field-of-view crop with isotropic resize and padding, FOV mask as a fourth input channel, adaptive illumination correction, dual-constraint stochastic CLAHE, augmentation and dataset-specific normalisation. 3. The dominance of the integrated configuration over the baseline was established on the training corpus for both architectures, in all three components of the conjunctive criterion. 4. The contribution of the individual stages was quantified by cumulative ablation under a single initialisation, and the parameters of the contrast stage and of the illumination correction were found to have an interior optimum confirmed on held-out data. 5. The reduction of distance to the training distribution was measured directly across six external corpora under a mandatory source-domain-statistics condition. 6. Transfer to corpora not seen in training was demonstrated — across datasets, across camera groupings and on two external clinical corpora — as was the superiority of the integrated configuration in a data-scarce regime. 7. A modular architecture for an automated DR screening system in resource-limited settings was designed and a working demonstrator of it was built, which runs the pipeline and the trained classifier end to end, produces attention maps and keeps a per-case record.</w:t>
       </w:r>
     </w:p>
     <w:p>
@@ -871,346 +378,12 @@
       <w:r>
         <w:rPr>
           <w:rFonts w:ascii="Times New Roman" w:hAnsi="Times New Roman" w:cs="Times New Roman" w:eastAsia="Times New Roman"/>
-          <w:b w:val="0"/>
-          <w:i w:val="0"/>
-          <w:sz w:val="28"/>
-          <w:u w:val="none"/>
-        </w:rPr>
-        <w:t>Each statement is submitted at the strength its pre-specified criterion supports, and each carries a qualification that is not detachable from it: a statement given without its qualification is a different and stronger proposition than the evidence supports.</w:t>
-      </w:r>
-    </w:p>
-    <w:p>
-      <w:pPr>
-        <w:ind w:left="709" w:hanging="397"/>
-        <w:jc w:val="both"/>
-      </w:pPr>
-      <w:r>
-        <w:rPr>
-          <w:rFonts w:ascii="Times New Roman" w:hAnsi="Times New Roman" w:cs="Times New Roman" w:eastAsia="Times New Roman"/>
-          <w:b w:val="0"/>
-          <w:i w:val="0"/>
-          <w:sz w:val="28"/>
-          <w:u w:val="none"/>
-        </w:rPr>
-        <w:t>1.</w:t>
-        <w:tab/>
-        <w:t xml:space="preserve">Preprocessing of fundus images is a formalisable and experimentally testable component of the diagnostic model rather than ancillary preparation of the data — the reframing from the end-to-end paradigm (P1) to the integrated paradigm (P2). </w:t>
-      </w:r>
-      <w:r>
-        <w:rPr>
-          <w:rFonts w:ascii="Times New Roman" w:hAnsi="Times New Roman" w:cs="Times New Roman" w:eastAsia="Times New Roman"/>
-          <w:b w:val="0"/>
-          <w:i/>
-          <w:sz w:val="28"/>
-          <w:u w:val="none"/>
-        </w:rPr>
-        <w:t>This statement is methodological and non-empirical: the experimental results are consistent with it under the conditions tested and do not establish it universally.</w:t>
-      </w:r>
-    </w:p>
-    <w:p>
-      <w:pPr>
-        <w:ind w:left="709" w:hanging="397"/>
-        <w:jc w:val="both"/>
-      </w:pPr>
-      <w:r>
-        <w:rPr>
-          <w:rFonts w:ascii="Times New Roman" w:hAnsi="Times New Roman" w:cs="Times New Roman" w:eastAsia="Times New Roman"/>
-          <w:b w:val="0"/>
-          <w:i w:val="0"/>
-          <w:sz w:val="28"/>
-          <w:u w:val="none"/>
-        </w:rPr>
-        <w:t>2.</w:t>
-        <w:tab/>
-        <w:t xml:space="preserve">The integrated configuration dominates the baseline configuration in five-class DR classification on EyePACS, on both ResNet-50 and EfficientNet-B3, under the conjunctive pre-registered criterion in all three of its components, with the effect surviving correction for multiple comparisons and showing no interaction with the choice of architecture. </w:t>
-      </w:r>
-      <w:r>
-        <w:rPr>
-          <w:rFonts w:ascii="Times New Roman" w:hAnsi="Times New Roman" w:cs="Times New Roman" w:eastAsia="Times New Roman"/>
-          <w:b w:val="0"/>
-          <w:i/>
-          <w:sz w:val="28"/>
-          <w:u w:val="none"/>
-        </w:rPr>
-        <w:t>The two arms differ in initialisation as well as in preprocessing, so the statement concerns the configuration as a whole; the cumulative ablation decomposes that composite but does not dissolve it, and no part of the effect is attributed to preprocessing alone.</w:t>
-      </w:r>
-    </w:p>
-    <w:p>
-      <w:pPr>
-        <w:ind w:left="709" w:hanging="397"/>
-        <w:jc w:val="both"/>
-      </w:pPr>
-      <w:r>
-        <w:rPr>
-          <w:rFonts w:ascii="Times New Roman" w:hAnsi="Times New Roman" w:cs="Times New Roman" w:eastAsia="Times New Roman"/>
-          <w:b w:val="0"/>
-          <w:i w:val="0"/>
-          <w:sz w:val="28"/>
-          <w:u w:val="none"/>
-        </w:rPr>
-        <w:t>3.</w:t>
-        <w:tab/>
-        <w:t xml:space="preserve">The dual-constraint CLAHE parameters and the flat-field σ each exhibit an interior optimum within the ranges examined, confirmed on held-out data. </w:t>
-      </w:r>
-      <w:r>
-        <w:rPr>
-          <w:rFonts w:ascii="Times New Roman" w:hAnsi="Times New Roman" w:cs="Times New Roman" w:eastAsia="Times New Roman"/>
-          <w:b w:val="0"/>
-          <w:i/>
-          <w:sz w:val="28"/>
-          <w:u w:val="none"/>
-        </w:rPr>
-        <w:t>Bounded to the ranges tested; the optimal values are properties of this corpus and pipeline rather than portable constants.</w:t>
-      </w:r>
-    </w:p>
-    <w:p>
-      <w:pPr>
-        <w:ind w:left="709" w:hanging="397"/>
-        <w:jc w:val="both"/>
-      </w:pPr>
-      <w:r>
-        <w:rPr>
-          <w:rFonts w:ascii="Times New Roman" w:hAnsi="Times New Roman" w:cs="Times New Roman" w:eastAsia="Times New Roman"/>
-          <w:b w:val="0"/>
-          <w:i w:val="0"/>
-          <w:sz w:val="28"/>
-          <w:u w:val="none"/>
-        </w:rPr>
-        <w:t>4.</w:t>
-        <w:tab/>
-        <w:t xml:space="preserve">The contributions of the individual pipeline stages are separable, monotone across folds, and orderable with the two photometric stages leading. </w:t>
-      </w:r>
-      <w:r>
-        <w:rPr>
-          <w:rFonts w:ascii="Times New Roman" w:hAnsi="Times New Roman" w:cs="Times New Roman" w:eastAsia="Times New Roman"/>
-          <w:b w:val="0"/>
-          <w:i/>
-          <w:sz w:val="28"/>
-          <w:u w:val="none"/>
-        </w:rPr>
-        <w:t>At the resolution of groupings only: adjacent ranks lie within noise, no strict ordering of the stages is submitted, and the FOV mask channel was not isolated.</w:t>
-      </w:r>
-    </w:p>
-    <w:p>
-      <w:pPr>
-        <w:ind w:left="709" w:hanging="397"/>
-        <w:jc w:val="both"/>
-      </w:pPr>
-      <w:r>
-        <w:rPr>
-          <w:rFonts w:ascii="Times New Roman" w:hAnsi="Times New Roman" w:cs="Times New Roman" w:eastAsia="Times New Roman"/>
-          <w:b w:val="0"/>
-          <w:i w:val="0"/>
-          <w:sz w:val="28"/>
-          <w:u w:val="none"/>
-        </w:rPr>
-        <w:t>5.</w:t>
-        <w:tab/>
-        <w:t xml:space="preserve">The integrated configuration reduces the distance between the training distribution and each external distribution in penultimate-layer feature space, on every external corpus examined, without any target-corpus statistic entering the transform. </w:t>
-      </w:r>
-      <w:r>
-        <w:rPr>
-          <w:rFonts w:ascii="Times New Roman" w:hAnsi="Times New Roman" w:cs="Times New Roman" w:eastAsia="Times New Roman"/>
-          <w:b w:val="0"/>
-          <w:i/>
-          <w:sz w:val="28"/>
-          <w:u w:val="none"/>
-        </w:rPr>
-        <w:t>In direction only — the magnitude of a distance reduction does not track the magnitude of any performance gain; the claim is mechanistic and carries no claim of diagnostic performance or device compatibility.</w:t>
-      </w:r>
-    </w:p>
-    <w:p>
-      <w:pPr>
-        <w:ind w:left="709" w:hanging="397"/>
-        <w:jc w:val="both"/>
-      </w:pPr>
-      <w:r>
-        <w:rPr>
-          <w:rFonts w:ascii="Times New Roman" w:hAnsi="Times New Roman" w:cs="Times New Roman" w:eastAsia="Times New Roman"/>
-          <w:b w:val="0"/>
-          <w:i w:val="0"/>
-          <w:sz w:val="28"/>
-          <w:u w:val="none"/>
-        </w:rPr>
-        <w:t>6.</w:t>
-        <w:tab/>
-        <w:t xml:space="preserve">A model trained on EyePACS with the pipeline transfers to APTOS 2019 without retraining, clearing the pre-registered generalisation ratio G ≥ 0.85 and exceeding the baseline on every grade. </w:t>
-      </w:r>
-      <w:r>
-        <w:rPr>
-          <w:rFonts w:ascii="Times New Roman" w:hAnsi="Times New Roman" w:cs="Times New Roman" w:eastAsia="Times New Roman"/>
-          <w:b w:val="0"/>
-          <w:i/>
-          <w:sz w:val="28"/>
-          <w:u w:val="none"/>
-        </w:rPr>
-        <w:t>The baseline configuration also clears the threshold, so the criterion does not discriminate between the arms; the evidence lies in the comparison.</w:t>
-      </w:r>
-    </w:p>
-    <w:p>
-      <w:pPr>
-        <w:ind w:left="709" w:hanging="397"/>
-        <w:jc w:val="both"/>
-      </w:pPr>
-      <w:r>
-        <w:rPr>
-          <w:rFonts w:ascii="Times New Roman" w:hAnsi="Times New Roman" w:cs="Times New Roman" w:eastAsia="Times New Roman"/>
-          <w:b w:val="0"/>
-          <w:i w:val="0"/>
-          <w:sz w:val="28"/>
-          <w:u w:val="none"/>
-        </w:rPr>
-        <w:t>7.</w:t>
-        <w:tab/>
-        <w:t xml:space="preserve">Model attention aligns more closely with expert pixel-level lesion annotation under the integrated configuration, on all four annotated lesion types, on both the primary and the secondary measure, and robustly across the attention threshold. </w:t>
-      </w:r>
-      <w:r>
-        <w:rPr>
-          <w:rFonts w:ascii="Times New Roman" w:hAnsi="Times New Roman" w:cs="Times New Roman" w:eastAsia="Times New Roman"/>
-          <w:b w:val="0"/>
-          <w:i/>
-          <w:sz w:val="28"/>
-          <w:u w:val="none"/>
-        </w:rPr>
-        <w:t>Alignment between model evidence and expert annotation, not clinical localisation of pathology; one annotated corpus and one fold; the qualitative examination on the clinical corpus was not carried out.</w:t>
-      </w:r>
-    </w:p>
-    <w:p>
-      <w:pPr>
-        <w:ind w:left="709" w:hanging="397"/>
-        <w:jc w:val="both"/>
-      </w:pPr>
-      <w:r>
-        <w:rPr>
-          <w:rFonts w:ascii="Times New Roman" w:hAnsi="Times New Roman" w:cs="Times New Roman" w:eastAsia="Times New Roman"/>
-          <w:b w:val="0"/>
-          <w:i w:val="0"/>
-          <w:sz w:val="28"/>
-          <w:u w:val="none"/>
-        </w:rPr>
-        <w:t>8.</w:t>
-        <w:tab/>
-        <w:t xml:space="preserve">Classification performance is maintained across every camera grouping examined and, substantively, the dispersion of performance across those groupings is reduced. </w:t>
-      </w:r>
-      <w:r>
-        <w:rPr>
-          <w:rFonts w:ascii="Times New Roman" w:hAnsi="Times New Roman" w:cs="Times New Roman" w:eastAsia="Times New Roman"/>
-          <w:b w:val="0"/>
-          <w:i/>
-          <w:sz w:val="28"/>
-          <w:u w:val="none"/>
-        </w:rPr>
-        <w:t>Both configurations clear the retention floor; two of the five groupings are the external clinical corpora themselves and furnish no independent replication; three groupings aggregate several camera models rather than a single device; no part of this constitutes device certification or a claim of device-agnostic deployment readiness.</w:t>
-      </w:r>
-    </w:p>
-    <w:p>
-      <w:pPr>
-        <w:ind w:left="709" w:hanging="397"/>
-        <w:jc w:val="both"/>
-      </w:pPr>
-      <w:r>
-        <w:rPr>
-          <w:rFonts w:ascii="Times New Roman" w:hAnsi="Times New Roman" w:cs="Times New Roman" w:eastAsia="Times New Roman"/>
-          <w:b w:val="0"/>
-          <w:i w:val="0"/>
-          <w:sz w:val="28"/>
-          <w:u w:val="none"/>
-        </w:rPr>
-        <w:t>9.</w:t>
-        <w:tab/>
-        <w:t xml:space="preserve">The integrated configuration attains higher absolute weighted F1 than the baseline on both external clinical corpora, each difference reaching the minimal clinically important difference with its confidence interval excluding zero, evaluated on each corpus separately. </w:t>
-      </w:r>
-      <w:r>
-        <w:rPr>
-          <w:rFonts w:ascii="Times New Roman" w:hAnsi="Times New Roman" w:cs="Times New Roman" w:eastAsia="Times New Roman"/>
-          <w:b w:val="0"/>
-          <w:i/>
-          <w:sz w:val="28"/>
-          <w:u w:val="none"/>
-        </w:rPr>
-        <w:t>Higher absolute external performance, not resistance to degradation — relative to their own in-domain levels the two configurations decline almost identically; the margin over the minimal important difference on the second corpus is 0.0041, and the lower bound of that interval lies below the minimal important difference.</w:t>
-      </w:r>
-    </w:p>
-    <w:p>
-      <w:pPr>
-        <w:ind w:left="709" w:hanging="397"/>
-        <w:jc w:val="both"/>
-      </w:pPr>
-      <w:r>
-        <w:rPr>
-          <w:rFonts w:ascii="Times New Roman" w:hAnsi="Times New Roman" w:cs="Times New Roman" w:eastAsia="Times New Roman"/>
-          <w:b w:val="0"/>
-          <w:i w:val="0"/>
-          <w:sz w:val="28"/>
-          <w:u w:val="none"/>
-        </w:rPr>
-        <w:t>10.</w:t>
-        <w:tab/>
-        <w:t xml:space="preserve">Three measures in common use for expressing external robustness — the degradation quantity, the generalisation ratio and the retention ratio — share a structural defect: each normalises or differences an arm's external performance against that same arm's in-domain performance, and therefore penalises a configuration for its in-domain strength. </w:t>
-      </w:r>
-      <w:r>
-        <w:rPr>
-          <w:rFonts w:ascii="Times New Roman" w:hAnsi="Times New Roman" w:cs="Times New Roman" w:eastAsia="Times New Roman"/>
-          <w:b w:val="0"/>
-          <w:i/>
-          <w:sz w:val="28"/>
-          <w:u w:val="none"/>
-        </w:rPr>
-        <w:t>Analytic and strictly descriptive: it rehabilitates no result of this work.</w:t>
-      </w:r>
-    </w:p>
-    <w:p>
-      <w:pPr>
-        <w:ind w:left="709" w:hanging="397"/>
-        <w:jc w:val="both"/>
-      </w:pPr>
-      <w:r>
-        <w:rPr>
-          <w:rFonts w:ascii="Times New Roman" w:hAnsi="Times New Roman" w:cs="Times New Roman" w:eastAsia="Times New Roman"/>
-          <w:b w:val="0"/>
-          <w:i w:val="0"/>
-          <w:sz w:val="28"/>
-          <w:u w:val="none"/>
-        </w:rPr>
-        <w:t>11.</w:t>
-        <w:tab/>
-        <w:t xml:space="preserve">A coupled thermal-optical model of fundus tissue response under laser exposure, and a modular architecture for an automated DR screening system in resource-limited environments, realised in part as a working demonstrator. </w:t>
-      </w:r>
-      <w:r>
-        <w:rPr>
-          <w:rFonts w:ascii="Times New Roman" w:hAnsi="Times New Roman" w:cs="Times New Roman" w:eastAsia="Times New Roman"/>
-          <w:b w:val="0"/>
-          <w:i/>
-          <w:sz w:val="28"/>
-          <w:u w:val="none"/>
-        </w:rPr>
-        <w:t>Submitted as theoretical and design contributions respectively — the model is not clinically validated; the demonstrator establishes realisability and operating behaviour and is evidence for no diagnostic claim; the deployment-oriented parts of the architecture remain specification, and no field testing was conducted.</w:t>
-      </w:r>
-    </w:p>
-    <w:p>
-      <w:pPr>
-        <w:ind w:firstLine="709"/>
-        <w:jc w:val="both"/>
-      </w:pPr>
-      <w:r>
-        <w:rPr>
-          <w:rFonts w:ascii="Times New Roman" w:hAnsi="Times New Roman" w:cs="Times New Roman" w:eastAsia="Times New Roman"/>
-          <w:b w:val="0"/>
-          <w:i w:val="0"/>
-          <w:sz w:val="28"/>
-          <w:u w:val="none"/>
-        </w:rPr>
-        <w:t xml:space="preserve">One further result is offered as an observation rather than as a statement for defence: in a preregistered evaluation on a corpus roughly one-seventieth the size of the training corpus, with both arms trained from the same initialisation, the integrated configuration was again the stronger, by a margin </w:t>
-      </w:r>
-      <w:r>
-        <w:rPr>
-          <w:rFonts w:ascii="Times New Roman" w:hAnsi="Times New Roman" w:cs="Times New Roman" w:eastAsia="Times New Roman"/>
           <w:b/>
           <w:i w:val="0"/>
           <w:sz w:val="28"/>
           <w:u w:val="none"/>
         </w:rPr>
-        <w:t>comparable to, and not larger than</w:t>
+        <w:t>Main provisions put forward for defence:</w:t>
       </w:r>
       <w:r>
         <w:rPr>
@@ -1220,50 +393,13 @@
           <w:sz w:val="28"/>
           <w:u w:val="none"/>
         </w:rPr>
-        <w:t>, the margin measured with abundant data. The clinical corpus involved cannot be redistributed, so that result is not externally reproducible.</w:t>
+        <w:t xml:space="preserve"> 1. Preprocessing of fundus images is a formalisable and experimentally testable component of the diagnostic model rather than ancillary preparation of the data; the provision is methodological. 2. The integrated configuration exceeds the baseline on the training corpus of 35,126 images, on both architectures, in all three components of the conjunctive criterion: weighted F1 by 6.54 and 6.55 percentage points, area under the curve by 0.032 and 0.036, and quadratic kappa by 0.11; every interval excludes zero, the comparisons survive correction for multiplicity, and there is no interaction between arm and architecture. The provision concerns the configuration as a whole: the arms differ in initialisation as well, so no part of the effect is attributed to preprocessing alone. 3. The contributions of the individual stages are separable: cumulative ablation over eight levels under one initialisation raises weighted F1 from 0.7538 to 0.8193, monotonically and without a single inversion in any of the five folds, each of the seven transitions contributing 0.0065 to 0.0143 against a between-fold dispersion of 0.0042 to 0.0060, and the two photometric stages together carry 41% of the gain. Both parameters exhibit an interior optimum confirmed on held-out data: a clip factor of 2.5 with a histogram threshold of 0.03, and a correction scale of 0.07 of the field diameter. 4. Distance from the training distribution falls on every one of six external corpora — by 0.070 to 0.093 at the penultimate layer, with every interval excluding zero — achieved without the transform observing any target corpus. 5. Competence transfers to corpora not seen in training: a generalisation ratio of 0.898 against 0.858 and a weighted F1 higher by 0.089 on the cross-corpus set; across five camera groupings performance is higher on every one and the spread between them contracts by factors of 2.4 and 3.1; and on two external clinical corpora the margin over the baseline is 0.069 and 0.054 in weighted F1, above the minimal clinically important difference of 0.050. 6. Model attention overlaps expert-annotated lesions more under the integrated configuration on all four annotated lesion types — by 0.099 to 0.129 at p ≤ 0.0148 — and the direction holds at every binarisation threshold; the provision is defended as alignment, not as localisation of pathology. 7. Also submitted are a coupled thermal-optical model of fundus tissue response under laser exposure, as a theoretical contribution, and a modular screening-system architecture as a design contribution, realised in part as a working demonstrator.</w:t>
       </w:r>
     </w:p>
     <w:p>
       <w:pPr>
         <w:ind w:firstLine="709"/>
         <w:jc w:val="both"/>
-      </w:pPr>
-      <w:r>
-        <w:rPr>
-          <w:rFonts w:ascii="Times New Roman" w:hAnsi="Times New Roman" w:cs="Times New Roman" w:eastAsia="Times New Roman"/>
-          <w:b w:val="0"/>
-          <w:i w:val="0"/>
-          <w:sz w:val="28"/>
-          <w:u w:val="none"/>
-        </w:rPr>
-        <w:t xml:space="preserve">The following are </w:t>
-      </w:r>
-      <w:r>
-        <w:rPr>
-          <w:rFonts w:ascii="Times New Roman" w:hAnsi="Times New Roman" w:cs="Times New Roman" w:eastAsia="Times New Roman"/>
-          <w:b/>
-          <w:i w:val="0"/>
-          <w:sz w:val="28"/>
-          <w:u w:val="none"/>
-        </w:rPr>
-        <w:t>not</w:t>
-      </w:r>
-      <w:r>
-        <w:rPr>
-          <w:rFonts w:ascii="Times New Roman" w:hAnsi="Times New Roman" w:cs="Times New Roman" w:eastAsia="Times New Roman"/>
-          <w:b w:val="0"/>
-          <w:i w:val="0"/>
-          <w:sz w:val="28"/>
-          <w:u w:val="none"/>
-        </w:rPr>
-        <w:t xml:space="preserve"> submitted: clinical validity, readiness for unsupervised deployment, device certification, localisation of pathology, superiority over any named published system, and extension beyond the corpora, devices and hardware on which the results were obtained.</w:t>
-      </w:r>
-    </w:p>
-    <w:p>
-      <w:pPr>
-        <w:keepNext/>
-        <w:spacing w:before="240" w:after="120"/>
-        <w:jc w:val="left"/>
       </w:pPr>
       <w:r>
         <w:rPr>
@@ -1275,12 +411,6 @@
         </w:rPr>
         <w:t>Theoretical significance</w:t>
       </w:r>
-    </w:p>
-    <w:p>
-      <w:pPr>
-        <w:ind w:firstLine="709"/>
-        <w:jc w:val="both"/>
-      </w:pPr>
       <w:r>
         <w:rPr>
           <w:rFonts w:ascii="Times New Roman" w:hAnsi="Times New Roman" w:cs="Times New Roman" w:eastAsia="Times New Roman"/>
@@ -1289,24 +419,7 @@
           <w:sz w:val="28"/>
           <w:u w:val="none"/>
         </w:rPr>
-        <w:t>The work contributes a conceptual reframing of preprocessing as an integral model component that co-determines the feature space available to the CNN (paradigm P2), and places this reframing under direct empirical test against the end-to-end paradigm (P1). It provides a formal specification of the 8-stage pipeline and mathematical formalisations of the dual-constraint CLAHE clip limit — which extends the candidate's previously published work rather than originating here — of the adaptive flat-field correction, and of the ALO explainability metric, together with a statistical framework for validating preprocessing effects under class imbalance. A further contribution is of a different kind: a mechanism hitherto invoked as an explanation is made measurable, as a quantity computable at the penultimate layer under a stated protocol condition (normalisation from source-domain statistics), which makes the mechanistic claim falsifiable independently of the performance claims it explains. The coupled thermal-optical model of fundus tissue response under laser exposure is a theoretical and computational contribution only.</w:t>
-      </w:r>
-    </w:p>
-    <w:p>
-      <w:pPr>
-        <w:keepNext/>
-        <w:spacing w:before="240" w:after="120"/>
-        <w:jc w:val="left"/>
-      </w:pPr>
-      <w:r>
-        <w:rPr>
-          <w:rFonts w:ascii="Times New Roman" w:hAnsi="Times New Roman" w:cs="Times New Roman" w:eastAsia="Times New Roman"/>
-          <w:b/>
-          <w:i w:val="0"/>
-          <w:sz w:val="28"/>
-          <w:u w:val="none"/>
-        </w:rPr>
-        <w:t>Practical significance</w:t>
+        <w:t xml:space="preserve"> lies in how the problem is posed and measured. The reframing changes what counts as a complete description of a diagnostic model of this class, and with it what counts as a fair comparison. Five formalisations make previously informal choices explicit and testable: the clip limit, the illumination correction, attention agreement as an asymmetric overlap, the postulated mechanism as a measurable distance, and the non-neutrality of a family of robustness measures in common use. A mechanism hitherto invoked as an explanation is made measurable — as a quantity computable at the penultimate layer under a stated protocol condition — which makes the mechanistic claim falsifiable independently of the performance claims it explains.</w:t>
       </w:r>
     </w:p>
     <w:p>
@@ -1317,19 +430,13 @@
       <w:r>
         <w:rPr>
           <w:rFonts w:ascii="Times New Roman" w:hAnsi="Times New Roman" w:cs="Times New Roman" w:eastAsia="Times New Roman"/>
-          <w:b w:val="0"/>
+          <w:b/>
           <w:i w:val="0"/>
           <w:sz w:val="28"/>
           <w:u w:val="none"/>
         </w:rPr>
-        <w:t>The integrated pipeline constitutes a fully specified, reproducible preprocessing regime for automated DR diagnosis under constrained computational conditions: it is defined stage by stage, with its operators, parameters and order of application, and its implementation is reproduced in Appendix A. The parameter values, however, were fixed on particular corpora and are properties of those corpora rather than portable constants.</w:t>
+        <w:t>Practical significance.</w:t>
       </w:r>
-    </w:p>
-    <w:p>
-      <w:pPr>
-        <w:ind w:firstLine="709"/>
-        <w:jc w:val="both"/>
-      </w:pPr>
       <w:r>
         <w:rPr>
           <w:rFonts w:ascii="Times New Roman" w:hAnsi="Times New Roman" w:cs="Times New Roman" w:eastAsia="Times New Roman"/>
@@ -1338,14 +445,13 @@
           <w:sz w:val="28"/>
           <w:u w:val="none"/>
         </w:rPr>
-        <w:t>A modular automated DR screening system architecture is proposed, with preprocessing-engine, inference, store-and-forward telemedicine, and physician-in-the-loop decision-support modules, integrable with PACS/EHR systems and the national eHealth platform, and applicable to DR screening in rural and underserved regions of Kazakhstan. A working demonstrator of the architecture is deployed and performs inference on submitted images, which establishes that the design is realisable and what it does in operation; the deployment-oriented parts it does not realise — PACS integration, EHR interoperability, telemedicine operation — remain design specifications, no deployment was tested clinically, and the data-protection provisions are alignment by design rather than certified compliance. The system is conceived as decision support in which the clinician retains the diagnosis and the responsibility for it; nothing here is offered as a standalone diagnostic instrument.</w:t>
+        <w:t xml:space="preserve"> The work makes four things practically available, each with its limit. A fully specified preprocessing regime, reproduced in an appendix, whose parameter values should be re-established rather than inherited. A screening system with preprocessing-engine, inference, store-and-forward telemedicine and physician-in-the-loop decision-support modules, integrable with PACS/EHR systems and the national eHealth platform; a working demonstrator of it is deployed and performs inference on submitted images, while the deployment-oriented parts remain design specifications and the data-protection provisions are alignment by design rather than certified compliance. A protocol for ingesting externally sourced images, validated only against the clinical source it was built for. And an argument of applicability to the national screening context, bounded by the absence of field testing there. The system is conceived as decision support in which the clinician retains the diagnosis and the responsibility for it.</w:t>
       </w:r>
     </w:p>
     <w:p>
       <w:pPr>
-        <w:keepNext/>
-        <w:spacing w:before="240" w:after="120"/>
-        <w:jc w:val="left"/>
+        <w:ind w:firstLine="709"/>
+        <w:jc w:val="both"/>
       </w:pPr>
       <w:r>
         <w:rPr>
@@ -1357,12 +463,6 @@
         </w:rPr>
         <w:t>Reliability of the results</w:t>
       </w:r>
-    </w:p>
-    <w:p>
-      <w:pPr>
-        <w:ind w:firstLine="709"/>
-        <w:jc w:val="both"/>
-      </w:pPr>
       <w:r>
         <w:rPr>
           <w:rFonts w:ascii="Times New Roman" w:hAnsi="Times New Roman" w:cs="Times New Roman" w:eastAsia="Times New Roman"/>
@@ -1371,24 +471,7 @@
           <w:sz w:val="28"/>
           <w:u w:val="none"/>
         </w:rPr>
-        <w:t>Reliability is ensured by: the use of large-scale and multiple public datasets (~35,126 EyePACS training images and seven additional datasets); 5-fold patient-level stratified cross-validation with strict leakage control; reporting of all primary metrics as mean ± standard deviation; a multi-metric assessment (weighted F1, ROC-AUC, Cohen's Kappa with quadratic weights, accuracy); statistical hypothesis testing (McNemar, DeLong), mixed-effects modelling across folds, bootstrap confidence intervals (≥ 1000 resamples), and Bonferroni/Holm correction; and success criteria fixed before the experiments that tested them — a criterion written once a result is known can always be satisfied, so the ordering is what makes the classification informative. The work is additionally placed against published systems without being ranked among them, since no two of the compared results share their task definition, corpus, reference standard and metric. Two limits of this apparatus are stated rather than reserved: correction for multiple comparisons is scoped to the single experiment within which the comparisons were planned, so no dissertation-wide error rate is claimed; and several evaluations rest on the models of one fitted fold, so their intervals quantify sampling of the evaluation corpus alone and understate total uncertainty in a known direction. A third is stated with them: one experiment depends on a clinical corpus that cannot be redistributed, so that result is not externally reproducible, and calibration — measured and reported — is an empirical property of a model's output probabilities, not a warrant of clinical decision-making reliability.</w:t>
-      </w:r>
-    </w:p>
-    <w:p>
-      <w:pPr>
-        <w:keepNext/>
-        <w:spacing w:before="240" w:after="120"/>
-        <w:jc w:val="left"/>
-      </w:pPr>
-      <w:r>
-        <w:rPr>
-          <w:rFonts w:ascii="Times New Roman" w:hAnsi="Times New Roman" w:cs="Times New Roman" w:eastAsia="Times New Roman"/>
-          <w:b/>
-          <w:i w:val="0"/>
-          <w:sz w:val="28"/>
-          <w:u w:val="none"/>
-        </w:rPr>
-        <w:t>Approbation of the results and connection with scientific programmes</w:t>
+        <w:t xml:space="preserve"> rests on procedure rather than on magnitude. Partitioning is patient-level and grade-stratified; performance is reported on a hierarchy of measures fixed in advance; differences are assessed by paired testing on identical cases, their uncertainty quantified by resampling, and a mixed-effects model separates fold variation from the effect under test. The strongest of these grounds is not visible in a table and is therefore stated: the acceptance criterion for each hypothesis was fixed before the experiment that tested it, and a criterion written once a result is known can always be satisfied. Three qualifications bound the apparatus in general: correction for multiplicity is scoped to the single experiment within which the comparisons were planned; several evaluations rest on the models of one fitted fold and so understate total uncertainty in a known direction; and one experiment depends on a clinical corpus that cannot be redistributed. Four attach to particular provisions: the stage ranking holds at the resolution of groupings only, and the two parameter optima are properties of this corpus rather than portable constants; the reduction in distance holds in direction only — its size predicts no gain; neither the generalisation ratio nor the camera-group floor discriminates between the arms, so the transfer evidence lies in the comparison, and on the second external clinical corpus the margin over the minimal important difference is four thousandths; and the attention result rests on one annotated corpus. Not submitted for defence are clinical validity, readiness for unsupervised deployment, device certification, localisation of pathology, and superiority over any named published system.</w:t>
       </w:r>
     </w:p>
     <w:p>
@@ -1399,12 +482,22 @@
       <w:r>
         <w:rPr>
           <w:rFonts w:ascii="Times New Roman" w:hAnsi="Times New Roman" w:cs="Times New Roman" w:eastAsia="Times New Roman"/>
+          <w:b/>
+          <w:i w:val="0"/>
+          <w:sz w:val="28"/>
+          <w:u w:val="none"/>
+        </w:rPr>
+        <w:t>Approbation of the results and connection with scientific programmes.</w:t>
+      </w:r>
+      <w:r>
+        <w:rPr>
+          <w:rFonts w:ascii="Times New Roman" w:hAnsi="Times New Roman" w:cs="Times New Roman" w:eastAsia="Times New Roman"/>
           <w:b w:val="0"/>
           <w:i w:val="0"/>
           <w:sz w:val="28"/>
           <w:u w:val="none"/>
         </w:rPr>
-        <w:t>The results of the research were reported and discussed at international scientific forums, including the 3rd International Workshop on Digital Society (DS 2025, Istanbul, Türkiye, 28–30 October 2025), and published in international peer-reviewed journals; the five works are listed below.</w:t>
+        <w:t xml:space="preserve"> The results of the research were reported and discussed at the 3rd International Workshop on Digital Society (DS 2025, Istanbul, Türkiye, 28–30 October 2025) and published in international peer-reviewed journals. The direction of the research corresponds to the state priorities of the Republic of Kazakhstan in the digitalisation of healthcare and the development of artificial-intelligence technologies, in particular the Concept for the Development of Artificial Intelligence for 2024–2029, the Address of the President of the Republic of Kazakhstan «Kazakhstan in the Era of Artificial Intelligence» of 8 September 2025, and the Law of the Republic of Kazakhstan «On Artificial Intelligence» of 17 November 2025. The work is carried out in accordance with subparagraph 2 of paragraph 3 of article 20 of the Law of the Republic of Kazakhstan «On Science». This is a correspondence between the direction of the research and published national priorities, not a statement that the work was funded under a state programme or commissioned by any body.</w:t>
       </w:r>
     </w:p>
     <w:p>
@@ -1415,19 +508,13 @@
       <w:r>
         <w:rPr>
           <w:rFonts w:ascii="Times New Roman" w:hAnsi="Times New Roman" w:cs="Times New Roman" w:eastAsia="Times New Roman"/>
-          <w:b w:val="0"/>
+          <w:b/>
           <w:i w:val="0"/>
           <w:sz w:val="28"/>
           <w:u w:val="none"/>
         </w:rPr>
-        <w:t>The research direction corresponds to the state priorities of healthcare digitalisation and the development of artificial-intelligence technologies of the Republic of Kazakhstan, in particular: the Concept for the Development of Artificial Intelligence for 2024–2029; the Address of the President of the Republic of Kazakhstan «Kazakhstan in the Era of Artificial Intelligence» (8 September 2025); and the Law of the Republic of Kazakhstan «On Artificial Intelligence» (No. 230-VIII, 17 November 2025). The work is carried out in accordance with subpara. 2, para. 3, art. 20 of the Law of the Republic of Kazakhstan «On Science».</w:t>
+        <w:t>Publications.</w:t>
       </w:r>
-    </w:p>
-    <w:p>
-      <w:pPr>
-        <w:ind w:firstLine="709"/>
-        <w:jc w:val="both"/>
-      </w:pPr>
       <w:r>
         <w:rPr>
           <w:rFonts w:ascii="Times New Roman" w:hAnsi="Times New Roman" w:cs="Times New Roman" w:eastAsia="Times New Roman"/>
@@ -1436,40 +523,7 @@
           <w:sz w:val="28"/>
           <w:u w:val="none"/>
         </w:rPr>
-        <w:t>This is a correspondence between the direction of the research and published national priorities: it is not a statement that the work was funded under a state programme, commissioned by any body, or performed under an institutional mandate, nor a claim that any policy objective has been achieved by it.</w:t>
-      </w:r>
-    </w:p>
-    <w:p>
-      <w:pPr>
-        <w:keepNext/>
-        <w:spacing w:before="240" w:after="120"/>
-        <w:jc w:val="left"/>
-      </w:pPr>
-      <w:r>
-        <w:rPr>
-          <w:rFonts w:ascii="Times New Roman" w:hAnsi="Times New Roman" w:cs="Times New Roman" w:eastAsia="Times New Roman"/>
-          <w:b/>
-          <w:i w:val="0"/>
-          <w:sz w:val="28"/>
-          <w:u w:val="none"/>
-        </w:rPr>
-        <w:t>Publications</w:t>
-      </w:r>
-    </w:p>
-    <w:p>
-      <w:pPr>
-        <w:ind w:firstLine="709"/>
-        <w:jc w:val="both"/>
-      </w:pPr>
-      <w:r>
-        <w:rPr>
-          <w:rFonts w:ascii="Times New Roman" w:hAnsi="Times New Roman" w:cs="Times New Roman" w:eastAsia="Times New Roman"/>
-          <w:b w:val="0"/>
-          <w:i w:val="0"/>
-          <w:sz w:val="28"/>
-          <w:u w:val="none"/>
-        </w:rPr>
-        <w:t>The main results of the dissertation are published in 5 scientific works, including: articles in journals indexed by Scopus / Web of Science — 1 (</w:t>
+        <w:t xml:space="preserve"> The main results of the dissertation are published in 5 scientific works, including: 1 article in a journal indexed in Scopus and Web of Science (</w:t>
       </w:r>
       <w:r>
         <w:rPr>
@@ -1489,7 +543,7 @@
           <w:sz w:val="28"/>
           <w:u w:val="none"/>
         </w:rPr>
-        <w:t>, Q3); a paper in international conference proceedings indexed by Scopus — 1 (</w:t>
+        <w:t>, Q3, CiteScore 2025 = 2.5, 42nd percentile in the category Computer Science Applications); 1 paper in Scopus-indexed international conference proceedings (</w:t>
       </w:r>
       <w:r>
         <w:rPr>
@@ -1509,18 +563,14 @@
           <w:sz w:val="28"/>
           <w:u w:val="none"/>
         </w:rPr>
-        <w:t>, DS 2025); and articles in journals recommended by the Committee for Quality Assurance in Science and Higher Education (KKSON) of the Republic of Kazakhstan — 3 (</w:t>
+        <w:t>); and 3 articles in journals recommended by the Committee for Quality Assurance in Science and Higher Education of the Republic of Kazakhstan.</w:t>
       </w:r>
-      <w:r>
-        <w:rPr>
-          <w:rFonts w:ascii="Times New Roman" w:hAnsi="Times New Roman" w:cs="Times New Roman" w:eastAsia="Times New Roman"/>
-          <w:b w:val="0"/>
-          <w:i/>
-          <w:sz w:val="28"/>
-          <w:u w:val="none"/>
-        </w:rPr>
-        <w:t>News of the NAS RK, Physico-Mathematical Series</w:t>
-      </w:r>
+    </w:p>
+    <w:p>
+      <w:pPr>
+        <w:ind w:firstLine="709"/>
+        <w:jc w:val="both"/>
+      </w:pPr>
       <w:r>
         <w:rPr>
           <w:rFonts w:ascii="Times New Roman" w:hAnsi="Times New Roman" w:cs="Times New Roman" w:eastAsia="Times New Roman"/>
@@ -1529,18 +579,14 @@
           <w:sz w:val="28"/>
           <w:u w:val="none"/>
         </w:rPr>
-        <w:t xml:space="preserve">; </w:t>
+        <w:t>The results obtained on the topic of the dissertation are presented in the following publications:</w:t>
       </w:r>
-      <w:r>
-        <w:rPr>
-          <w:rFonts w:ascii="Times New Roman" w:hAnsi="Times New Roman" w:cs="Times New Roman" w:eastAsia="Times New Roman"/>
-          <w:b w:val="0"/>
-          <w:i/>
-          <w:sz w:val="28"/>
-          <w:u w:val="none"/>
-        </w:rPr>
-        <w:t>Herald of the Kazakh-British Technical University</w:t>
-      </w:r>
+    </w:p>
+    <w:p>
+      <w:pPr>
+        <w:ind w:firstLine="709"/>
+        <w:jc w:val="both"/>
+      </w:pPr>
       <w:r>
         <w:rPr>
           <w:rFonts w:ascii="Times New Roman" w:hAnsi="Times New Roman" w:cs="Times New Roman" w:eastAsia="Times New Roman"/>
@@ -1549,18 +595,14 @@
           <w:sz w:val="28"/>
           <w:u w:val="none"/>
         </w:rPr>
-        <w:t xml:space="preserve">; </w:t>
+        <w:t>1. Sapakova S., Yesmukhamedov N., Sapakov A. Development of an image quality enhancement approach for diabetic retinopathy diagnosis // Eastern-European Journal of Enterprise Technologies. — 2025. — Vol. 4, No. 9(136). — P. 79–88. https://doi.org/10.15587/1729-4061.2025.335570.</w:t>
       </w:r>
-      <w:r>
-        <w:rPr>
-          <w:rFonts w:ascii="Times New Roman" w:hAnsi="Times New Roman" w:cs="Times New Roman" w:eastAsia="Times New Roman"/>
-          <w:b w:val="0"/>
-          <w:i/>
-          <w:sz w:val="28"/>
-          <w:u w:val="none"/>
-        </w:rPr>
-        <w:t>Herald of KazUTB</w:t>
-      </w:r>
+    </w:p>
+    <w:p>
+      <w:pPr>
+        <w:ind w:firstLine="709"/>
+        <w:jc w:val="both"/>
+      </w:pPr>
       <w:r>
         <w:rPr>
           <w:rFonts w:ascii="Times New Roman" w:hAnsi="Times New Roman" w:cs="Times New Roman" w:eastAsia="Times New Roman"/>
@@ -1569,7 +611,55 @@
           <w:sz w:val="28"/>
           <w:u w:val="none"/>
         </w:rPr>
-        <w:t>).</w:t>
+        <w:t>2. Sapakova S., Yesmukhamedov N., Sapakov A., Yemberdiyeva A., Kozhamkulova Z. Methods for pre-processing and analysis of fundus images for detection of diabetic retinopathy // Procedia Computer Science. — 2025. — Vol. 272. — P. 496–501 (The 3rd International Workshop on Digital Society, DS 2025, Istanbul, Türkiye). https://doi.org/10.1016/j.procs.2025.10.237.</w:t>
+      </w:r>
+    </w:p>
+    <w:p>
+      <w:pPr>
+        <w:ind w:firstLine="709"/>
+        <w:jc w:val="both"/>
+      </w:pPr>
+      <w:r>
+        <w:rPr>
+          <w:rFonts w:ascii="Times New Roman" w:hAnsi="Times New Roman" w:cs="Times New Roman" w:eastAsia="Times New Roman"/>
+          <w:b w:val="0"/>
+          <w:i w:val="0"/>
+          <w:sz w:val="28"/>
+          <w:u w:val="none"/>
+        </w:rPr>
+        <w:t>3. Yesmukhamedov N.S., Sapakova S., Al-Haddad S.A.R., Daniyarova D. Development of an information system architecture for healthcare institutions using artificial intelligence // News of the National Academy of Sciences of the Republic of Kazakhstan, Physico-Mathematical Series. — 2025. — Vol. 2(354). — P. 74–91. https://doi.org/10.32014/2025.2518-1726.345.</w:t>
+      </w:r>
+    </w:p>
+    <w:p>
+      <w:pPr>
+        <w:ind w:firstLine="709"/>
+        <w:jc w:val="both"/>
+      </w:pPr>
+      <w:r>
+        <w:rPr>
+          <w:rFonts w:ascii="Times New Roman" w:hAnsi="Times New Roman" w:cs="Times New Roman" w:eastAsia="Times New Roman"/>
+          <w:b w:val="0"/>
+          <w:i w:val="0"/>
+          <w:sz w:val="28"/>
+          <w:u w:val="none"/>
+        </w:rPr>
+        <w:t>4. Yesmukhamedov N.S., Sapakova S.Z., Kozhamkulova Zh.Zh., Daniyarova D.R., Armankyzy R. Methods for preprocessing and analysis of fundus images for diabetic retinopathy detection // Herald of the Kazakh-British Technical University. — 2025. — No. 4(75), Vol. 22. — P. 119–130. https://doi.org/10.55452/1998-6688-2025-22-4-119-130.</w:t>
+      </w:r>
+    </w:p>
+    <w:p>
+      <w:pPr>
+        <w:ind w:firstLine="709"/>
+        <w:jc w:val="both"/>
+      </w:pPr>
+      <w:r>
+        <w:rPr>
+          <w:rFonts w:ascii="Times New Roman" w:hAnsi="Times New Roman" w:cs="Times New Roman" w:eastAsia="Times New Roman"/>
+          <w:b w:val="0"/>
+          <w:i w:val="0"/>
+          <w:sz w:val="28"/>
+          <w:u w:val="none"/>
+        </w:rPr>
+        <w:t>5. Sapakova S.Z., Daniyarova D.R., Yesmukhamedov N.S., Armankyzy R., Yemberdiyeva A.B., Kaldybaeva A.S. Mathematical modeling of laser exposure on fundus tissues in the treatment of diabetic retinopathy // Herald of KazUTB. — 2025. — Vol. 2, No. 27-740. — P. 20–30. https://doi.org/10.58805/kazutb.v.2.27-740.</w:t>
       </w:r>
     </w:p>
     <w:p>
@@ -1585,14 +675,8 @@
           <w:sz w:val="28"/>
           <w:u w:val="none"/>
         </w:rPr>
-        <w:t>Articles in journals indexed by Scopus / Web of Science:</w:t>
+        <w:t>Main content of the work.</w:t>
       </w:r>
-    </w:p>
-    <w:p>
-      <w:pPr>
-        <w:ind w:left="709" w:hanging="397"/>
-        <w:jc w:val="both"/>
-      </w:pPr>
       <w:r>
         <w:rPr>
           <w:rFonts w:ascii="Times New Roman" w:hAnsi="Times New Roman" w:cs="Times New Roman" w:eastAsia="Times New Roman"/>
@@ -1601,9 +685,7 @@
           <w:sz w:val="28"/>
           <w:u w:val="none"/>
         </w:rPr>
-        <w:t>1.</w:t>
-        <w:tab/>
-        <w:t>Sapakova S., Yesmukhamedov N., Sapakov A. Development of an image quality enhancement approach for diabetic retinopathy diagnosis // Eastern-European Journal of Enterprise Technologies. — 2025. — Vol. 4, No. 9(136). — P. 79–88. (Scopus, Q3). https://doi.org/10.15587/1729-4061.2025.335570</w:t>
+        <w:t xml:space="preserve"> The introduction substantiates the relevance of the topic and formulates the aim, the objectives, the object and subject of the research, the scientific novelty, the provisions submitted for defence, the methodological basis, the significance of the work, the reliability of the results, the approbation and the publications. Chapter 1 establishes the clinical and technical context of screening: it characterises the grading of the disease and what a screening programme demands of a resource-limited setting, identifies the sources of image-quality loss and its device-specific component, reviews what the field has done with convolutional networks and what its automated systems assume about preprocessing, and formulates the research problem that follows from that practice. Chapter 2 specifies the methodology: it sets out the 8-stage pipeline with the theory grounding each stage, formalises the clip limit and the illumination correction, describes the classification architectures and their adaptation to a four-channel input, states the pretraining and fine-tuning strategy and the explainability formalism, and fixes the evaluation protocol in advance. Chapter 3 reports the experimental programme: the in-domain factorial contrast, the stage decomposition with its parameter sweeps, the direct measurement of source-to-target distance, cross-corpus and external clinical transfer, the alignment of attention with expert annotation, behaviour across camera groupings and in a data-scarce regime, the statistical validation and the limitations bounding the results. Chapter 4 describes the screening system: its architecture, its inference behaviour without acceleration hardware and its ingestion protocol, distinguishing what exists from what remains specification. The conclusion consolidates the outcomes and the directions of further work.</w:t>
       </w:r>
     </w:p>
     <w:p>
@@ -1619,14 +701,8 @@
           <w:sz w:val="28"/>
           <w:u w:val="none"/>
         </w:rPr>
-        <w:t>Papers in international conference proceedings indexed by Scopus:</w:t>
+        <w:t>Author's personal contribution.</w:t>
       </w:r>
-    </w:p>
-    <w:p>
-      <w:pPr>
-        <w:ind w:left="709" w:hanging="397"/>
-        <w:jc w:val="both"/>
-      </w:pPr>
       <w:r>
         <w:rPr>
           <w:rFonts w:ascii="Times New Roman" w:hAnsi="Times New Roman" w:cs="Times New Roman" w:eastAsia="Times New Roman"/>
@@ -1635,9 +711,7 @@
           <w:sz w:val="28"/>
           <w:u w:val="none"/>
         </w:rPr>
-        <w:t>2.</w:t>
-        <w:tab/>
-        <w:t>Sapakova S., Yesmukhamedov N., Sapakov A., Yemberdiyeva A., Kozhamkulova Z. Methods for pre-processing and analysis of fundus images for detection of diabetic retinopathy // Procedia Computer Science. — 2025. — Vol. 272. — P. 496–501. (The 3rd International Workshop on Digital Society — DS 2025, Istanbul, Türkiye). https://doi.org/10.1016/j.procs.2025.10.237</w:t>
+        <w:t xml:space="preserve"> The principal results of the dissertation were obtained by the author personally: the conceptual reframing of preprocessing as an integral component of the diagnostic model; the design and formal specification of the 8-stage pipeline, including the dual-constraint stochastic CLAHE, the adaptive illumination correction and the FOV-mask input channel; the Attention–Lesion Overlap measure; the controlled experimental design and the statistical validation framework; and the architecture of the screening system. All five publications are co-authored; in each the author contributed the part on which this dissertation rests: the formulation of the preprocessing problem, the design and implementation of the pipeline, the conduct of the experiments and the writing of the corresponding sections.</w:t>
       </w:r>
     </w:p>
     <w:p>
@@ -1653,94 +727,7 @@
           <w:sz w:val="28"/>
           <w:u w:val="none"/>
         </w:rPr>
-        <w:t>Articles in journals recommended by the KKSON of the Republic of Kazakhstan:</w:t>
-      </w:r>
-    </w:p>
-    <w:p>
-      <w:pPr>
-        <w:ind w:left="709" w:hanging="397"/>
-        <w:jc w:val="both"/>
-      </w:pPr>
-      <w:r>
-        <w:rPr>
-          <w:rFonts w:ascii="Times New Roman" w:hAnsi="Times New Roman" w:cs="Times New Roman" w:eastAsia="Times New Roman"/>
-          <w:b w:val="0"/>
-          <w:i w:val="0"/>
-          <w:sz w:val="28"/>
-          <w:u w:val="none"/>
-        </w:rPr>
-        <w:t>3.</w:t>
-        <w:tab/>
-        <w:t>Yesmukhamedov N.S., Sapakova S., Al-Haddad S.A.R., Daniyarova D. Development of an information system architecture for healthcare institutions using artificial intelligence // News of the National Academy of Sciences of the Republic of Kazakhstan, Physico-Mathematical Series. — 2025. — Vol. 2(354). — P. 74–91. https://doi.org/10.32014/2025.2518-1726.345</w:t>
-      </w:r>
-    </w:p>
-    <w:p>
-      <w:pPr>
-        <w:ind w:left="709" w:hanging="397"/>
-        <w:jc w:val="both"/>
-      </w:pPr>
-      <w:r>
-        <w:rPr>
-          <w:rFonts w:ascii="Times New Roman" w:hAnsi="Times New Roman" w:cs="Times New Roman" w:eastAsia="Times New Roman"/>
-          <w:b w:val="0"/>
-          <w:i w:val="0"/>
-          <w:sz w:val="28"/>
-          <w:u w:val="none"/>
-        </w:rPr>
-        <w:t>4.</w:t>
-        <w:tab/>
-        <w:t>Yesmukhamedov N.S., Sapakova S.Z., Kozhamkulova Zh.Zh., Daniyarova D.R., Armankyzy R. Methods for preprocessing and analysis of fundus images for diabetic retinopathy detection // Herald of the Kazakh-British Technical University. — 2025. — No. 4(75). — Vol. 22. — P. 119–130. https://doi.org/10.55452/1998-6688-2025-22-4-119-130</w:t>
-      </w:r>
-    </w:p>
-    <w:p>
-      <w:pPr>
-        <w:ind w:left="709" w:hanging="397"/>
-        <w:jc w:val="both"/>
-      </w:pPr>
-      <w:r>
-        <w:rPr>
-          <w:rFonts w:ascii="Times New Roman" w:hAnsi="Times New Roman" w:cs="Times New Roman" w:eastAsia="Times New Roman"/>
-          <w:b w:val="0"/>
-          <w:i w:val="0"/>
-          <w:sz w:val="28"/>
-          <w:u w:val="none"/>
-        </w:rPr>
-        <w:t>5.</w:t>
-        <w:tab/>
-        <w:t>Sapakova S.Z., Daniyarova D.R., Yesmukhamedov N.S., Armankyzy R., Yemberdiyeva A.B., Kaldybaeva A.S. Mathematical modeling of laser exposure on fundus tissues in the treatment of diabetic retinopathy // Herald of KazUTB. — 2025. — Vol. 2, No. 27-740. https://doi.org/10.58805/kazutb.v.2.27-740</w:t>
-      </w:r>
-    </w:p>
-    <w:p>
-      <w:pPr>
-        <w:keepNext/>
-        <w:spacing w:before="240" w:after="120"/>
-        <w:jc w:val="left"/>
-      </w:pPr>
-      <w:r>
-        <w:rPr>
-          <w:rFonts w:ascii="Times New Roman" w:hAnsi="Times New Roman" w:cs="Times New Roman" w:eastAsia="Times New Roman"/>
-          <w:b/>
-          <w:i w:val="0"/>
-          <w:sz w:val="28"/>
-          <w:u w:val="none"/>
-        </w:rPr>
-        <w:t>Main content of the work</w:t>
-      </w:r>
-    </w:p>
-    <w:p>
-      <w:pPr>
-        <w:ind w:firstLine="709"/>
-        <w:jc w:val="both"/>
-      </w:pPr>
-      <w:r>
-        <w:rPr>
-          <w:rFonts w:ascii="Times New Roman" w:hAnsi="Times New Roman" w:cs="Times New Roman" w:eastAsia="Times New Roman"/>
-          <w:b/>
-          <w:i w:val="0"/>
-          <w:sz w:val="28"/>
-          <w:u w:val="none"/>
-        </w:rPr>
-        <w:t>The introduction</w:t>
+        <w:t>Structure and scope of the work.</w:t>
       </w:r>
       <w:r>
         <w:rPr>
@@ -1750,193 +737,7 @@
           <w:sz w:val="28"/>
           <w:u w:val="none"/>
         </w:rPr>
-        <w:t xml:space="preserve"> substantiates the relevance of the topic, formulates the aim, objectives, object and subject of the research, the central hypothesis, the scientific novelty, the statements submitted for defense, the methodological basis, the theoretical and practical significance, the reliability of the results, the empirical basis, the approbation, the connection with scientific programmes, and the publications, and describes the structure and length of the dissertation.</w:t>
-      </w:r>
-    </w:p>
-    <w:p>
-      <w:pPr>
-        <w:ind w:firstLine="709"/>
-        <w:jc w:val="both"/>
-      </w:pPr>
-      <w:r>
-        <w:rPr>
-          <w:rFonts w:ascii="Times New Roman" w:hAnsi="Times New Roman" w:cs="Times New Roman" w:eastAsia="Times New Roman"/>
-          <w:b/>
-          <w:i w:val="0"/>
-          <w:sz w:val="28"/>
-          <w:u w:val="none"/>
-        </w:rPr>
-        <w:t>Chapter 1 — "Automated diabetic retinopathy screening"</w:t>
-      </w:r>
-      <w:r>
-        <w:rPr>
-          <w:rFonts w:ascii="Times New Roman" w:hAnsi="Times New Roman" w:cs="Times New Roman" w:eastAsia="Times New Roman"/>
-          <w:b w:val="0"/>
-          <w:i w:val="0"/>
-          <w:sz w:val="28"/>
-          <w:u w:val="none"/>
-        </w:rPr>
-        <w:t xml:space="preserve"> establishes the clinical and technical context of screening: the ordinal five-class grading of the disease and the clinical cost of a misgrading, the screening requirements of resource-limited settings, the physics of laser coagulation as bounded theoretical context for referral, the sources of fundus image quality loss and its device-specific component, what the field has achieved with convolutional networks (architectures, transfer and self-supervised pretraining, explainability), and a critical analysis of existing automated screening systems and the conditions that bound their reported figures, concluding with the formulation of the research problem and the justification of the research direction.</w:t>
-      </w:r>
-    </w:p>
-    <w:p>
-      <w:pPr>
-        <w:ind w:firstLine="709"/>
-        <w:jc w:val="both"/>
-      </w:pPr>
-      <w:r>
-        <w:rPr>
-          <w:rFonts w:ascii="Times New Roman" w:hAnsi="Times New Roman" w:cs="Times New Roman" w:eastAsia="Times New Roman"/>
-          <w:b/>
-          <w:i w:val="0"/>
-          <w:sz w:val="28"/>
-          <w:u w:val="none"/>
-        </w:rPr>
-        <w:t>Chapter 2 — "Methodology of the integrated pipeline"</w:t>
-      </w:r>
-      <w:r>
-        <w:rPr>
-          <w:rFonts w:ascii="Times New Roman" w:hAnsi="Times New Roman" w:cs="Times New Roman" w:eastAsia="Times New Roman"/>
-          <w:b w:val="0"/>
-          <w:i w:val="0"/>
-          <w:sz w:val="28"/>
-          <w:u w:val="none"/>
-        </w:rPr>
-        <w:t xml:space="preserve"> specifies the integrated methodology. It formalises the 8-stage preprocessing pipeline stage by stage together with the theoretical foundations of each — canonical orientation and landmark-based rotation normalisation, isotropic resize with centred padding, the field-of-view mask as a fourth input channel, adaptive flat-field correction scaled to per-image geometry, and the dual-constraint clip limit of the CLAHE stage, formalised as the minimum of a histogram-relative and a tile-relative constraint and applied stochastically at training time. It then specifies the classification architectures (ResNet-50 and EfficientNet-B3) and their adaptation to five-class grading with the weighted (Focal) loss, the pretraining and fine-tuning strategy with its frozen-backbone linear-probe acceptance gate, the explainability formalism (Grad-CAM, the Attention–Lesion Overlap metric, IoU) with the image-quality measures, and the evaluation hierarchy and statistical protocol.</w:t>
-      </w:r>
-    </w:p>
-    <w:p>
-      <w:pPr>
-        <w:ind w:firstLine="709"/>
-        <w:jc w:val="both"/>
-      </w:pPr>
-      <w:r>
-        <w:rPr>
-          <w:rFonts w:ascii="Times New Roman" w:hAnsi="Times New Roman" w:cs="Times New Roman" w:eastAsia="Times New Roman"/>
-          <w:b/>
-          <w:i w:val="0"/>
-          <w:sz w:val="28"/>
-          <w:u w:val="none"/>
-        </w:rPr>
-        <w:t>Chapter 3 — "Experimental results"</w:t>
-      </w:r>
-      <w:r>
-        <w:rPr>
-          <w:rFonts w:ascii="Times New Roman" w:hAnsi="Times New Roman" w:cs="Times New Roman" w:eastAsia="Times New Roman"/>
-          <w:b w:val="0"/>
-          <w:i w:val="0"/>
-          <w:sz w:val="28"/>
-          <w:u w:val="none"/>
-        </w:rPr>
-        <w:t xml:space="preserve"> reports the experimental programme on the tiered corpus: the datasets and experimental configuration; the effect of the pipeline on accuracy under the 2×2 factorial design (Experiment 1); the cumulative stage ablation with the CLAHE clip-limit and flat-field σ sweeps (Experiment 2); the direct measurement of source-to-target distance in penultimate-layer feature space across six external corpora; cross-dataset transfer to APTOS 2019 and external clinical evaluation on IDRiD and Messidor-2 (Experiments 3 and 5), with behaviour across camera groupings (Experiment 6); the agreement of attention maps with expert pixel-level lesion annotation (Experiment 4); training on small clinical samples (Experiment 7); and the statistical validation and the comparative placement of the results against published systems without ranking among them, closing with the limitations and boundary conditions of the approach.</w:t>
-      </w:r>
-    </w:p>
-    <w:p>
-      <w:pPr>
-        <w:ind w:firstLine="709"/>
-        <w:jc w:val="both"/>
-      </w:pPr>
-      <w:r>
-        <w:rPr>
-          <w:rFonts w:ascii="Times New Roman" w:hAnsi="Times New Roman" w:cs="Times New Roman" w:eastAsia="Times New Roman"/>
-          <w:b/>
-          <w:i w:val="0"/>
-          <w:sz w:val="28"/>
-          <w:u w:val="none"/>
-        </w:rPr>
-        <w:t>Chapter 4 — "The screening system"</w:t>
-      </w:r>
-      <w:r>
-        <w:rPr>
-          <w:rFonts w:ascii="Times New Roman" w:hAnsi="Times New Roman" w:cs="Times New Roman" w:eastAsia="Times New Roman"/>
-          <w:b w:val="0"/>
-          <w:i w:val="0"/>
-          <w:sz w:val="28"/>
-          <w:u w:val="none"/>
-        </w:rPr>
-        <w:t xml:space="preserve"> describes the screening system built around the model, distinguishing throughout what was realised from what remains specification: the modular architecture and its modules, the preprocessing and inference services with their interface, the clinical workflow and the operator interface in which the ophthalmologist reviews and records a verdict, and the deployment envelope and data-protection framework (GDPR/HIPAA-aligned by design), with the applicability to Kazakhstan healthcare infrastructure bounded by the absence of field testing there.</w:t>
-      </w:r>
-    </w:p>
-    <w:p>
-      <w:pPr>
-        <w:keepNext/>
-        <w:spacing w:before="240" w:after="120"/>
-        <w:jc w:val="left"/>
-      </w:pPr>
-      <w:r>
-        <w:rPr>
-          <w:rFonts w:ascii="Times New Roman" w:hAnsi="Times New Roman" w:cs="Times New Roman" w:eastAsia="Times New Roman"/>
-          <w:b/>
-          <w:i w:val="0"/>
-          <w:sz w:val="28"/>
-          <w:u w:val="none"/>
-        </w:rPr>
-        <w:t>Author's personal contribution</w:t>
-      </w:r>
-    </w:p>
-    <w:p>
-      <w:pPr>
-        <w:ind w:firstLine="709"/>
-        <w:jc w:val="both"/>
-      </w:pPr>
-      <w:r>
-        <w:rPr>
-          <w:rFonts w:ascii="Times New Roman" w:hAnsi="Times New Roman" w:cs="Times New Roman" w:eastAsia="Times New Roman"/>
-          <w:b w:val="0"/>
-          <w:i w:val="0"/>
-          <w:sz w:val="28"/>
-          <w:u w:val="none"/>
-        </w:rPr>
-        <w:t>The principal results of the dissertation were obtained by the author personally: the conceptual reframing of preprocessing as an integral component of the diagnostic model (paradigm P2); the design and formal specification of the 8-stage preprocessing pipeline, including the dual-constraint stochastic CLAHE, the adaptive flat-field correction, and the FOV-mask input channel; the Attention–Lesion Overlap (ALO) explainability metric; the controlled experimental design and statistical validation framework; and the architecture of the automated DR screening system. In the joint publications the author developed the fundus image preprocessing and analysis methods and prepared the corresponding parts of the manuscripts.</w:t>
-      </w:r>
-    </w:p>
-    <w:p>
-      <w:pPr>
-        <w:keepNext/>
-        <w:spacing w:before="240" w:after="120"/>
-        <w:jc w:val="left"/>
-      </w:pPr>
-      <w:r>
-        <w:rPr>
-          <w:rFonts w:ascii="Times New Roman" w:hAnsi="Times New Roman" w:cs="Times New Roman" w:eastAsia="Times New Roman"/>
-          <w:b/>
-          <w:i w:val="0"/>
-          <w:sz w:val="28"/>
-          <w:u w:val="none"/>
-        </w:rPr>
-        <w:t>Structure and length of the dissertation</w:t>
-      </w:r>
-    </w:p>
-    <w:p>
-      <w:pPr>
-        <w:ind w:firstLine="709"/>
-        <w:jc w:val="both"/>
-      </w:pPr>
-      <w:r>
-        <w:rPr>
-          <w:rFonts w:ascii="Times New Roman" w:hAnsi="Times New Roman" w:cs="Times New Roman" w:eastAsia="Times New Roman"/>
-          <w:b w:val="0"/>
-          <w:i w:val="0"/>
-          <w:sz w:val="28"/>
-          <w:u w:val="none"/>
-        </w:rPr>
-        <w:t>The dissertation consists of front matter — normative references, definitions, and designations and abbreviations — followed by an introduction, four chapters, a conclusion, a list of references used, and five appendices (A–E): the source code of the preprocessing pipeline, supplementary experimental results and confusion matrices, the system architecture with the working demonstrator, the attention-map gallery, and supplementary tables for the device-domain evaluation.</w:t>
-      </w:r>
-    </w:p>
-    <w:p>
-      <w:pPr>
-        <w:ind w:firstLine="709"/>
-        <w:jc w:val="both"/>
-      </w:pPr>
-      <w:r>
-        <w:rPr>
-          <w:rFonts w:ascii="Times New Roman" w:hAnsi="Times New Roman" w:cs="Times New Roman" w:eastAsia="Times New Roman"/>
-          <w:b w:val="0"/>
-          <w:i w:val="0"/>
-          <w:sz w:val="28"/>
-          <w:u w:val="none"/>
-        </w:rPr>
-        <w:t>The dissertation is set out on 113 pages, and contains 19 tables and 16 figures. The list of references comprises 102 sources. The counts are of the dissertation excluding the appendices.</w:t>
+        <w:t xml:space="preserve"> The dissertation comprises front matter, an introduction, four chapters, a conclusion, a list of references and five appendices. The dissertation is set out on 113 pages and contains 19 tables and 16 figures. The list of references comprises 102 sources. The counts are of the dissertation excluding the appendices.</w:t>
       </w:r>
     </w:p>
     <w:sectPr>

</xml_diff>